<commit_message>
docs: expand slides with module specs and algorithms
</commit_message>
<xml_diff>
--- a/output/docs/kich_ban_thuyet_trinh_ho_si_phu.docx
+++ b/output/docs/kich_ban_thuyet_trinh_ho_si_phu.docx
@@ -99,7 +99,7 @@
                 <w:color w:val="111111"/>
                 <w:sz w:val="21"/>
               </w:rPr>
-              <w:t>Khoảng 8–10 phút</w:t>
+              <w:t>Khoảng 10–12 phút</w:t>
             </w:r>
           </w:p>
         </w:tc>
@@ -704,7 +704,7 @@
           <w:color w:val="111111"/>
           <w:sz w:val="32"/>
         </w:rPr>
-        <w:t>Slide 5 — Phần cứng dùng I2C chung và UART riêng cho GPS</w:t>
+        <w:t>Slide 5 — Thông số cơ bản được chọn theo đúng cấu hình firmware</w:t>
       </w:r>
     </w:p>
     <w:p>
@@ -720,7 +720,7 @@
           <w:color w:val="696969"/>
           <w:sz w:val="19"/>
         </w:rPr>
-        <w:t>Thời lượng gợi ý: 40–50 giây</w:t>
+        <w:t>Thời lượng gợi ý: 55–65 giây</w:t>
       </w:r>
     </w:p>
     <w:p>
@@ -746,7 +746,38 @@
           <w:color w:val="111111"/>
           <w:sz w:val="22"/>
         </w:rPr>
-        <w:t>OLED, MAX30102 và IMU cùng dùng bus I2C trên GPIO 8 và 9, nhưng có địa chỉ riêng lần lượt là 0x3C, 0x57 và 0x68. GPS dùng UART1 tại RX21 và TX47 nên không chiếm bus I2C. Buzzer dùng LEDC PWM ở GPIO42. Cấu hình này giảm số chân cần sử dụng nhưng đòi hỏi tránh mọi thiết bị khác chiếm GPIO 8 và 9; vì vậy camera phải tách khỏi hai chân này. Trước khi chạy, firmware quét địa chỉ và có cơ chế thử kết nối lại nếu một mô-đun bị mất liên lạc.</w:t>
+        <w:t>ESP32-S3 N16R8 chạy tối đa 240 MHz, có 16 MB flash và 8 MB PSRAM. OLED SSD1306 có độ phân giải 128 nhân 64, địa chỉ 0x3C và được cập nhật 10 lần mỗi giây. MAX30102 ở địa chỉ 0x57, ADC 18 bit; ADC lấy 400 mẫu mỗi giây rồi trung bình bốn mẫu trong phần cứng, vì vậy FIFO đưa cho thuật toán đúng 100 mẫu mỗi giây. IMU dùng địa chỉ 0x68, thang cộng trừ 2g, bộ lọc số khoảng 44 Hz và được đọc ở 50 Hz. GPS dùng UART1 9.600 baud tại RX21, TX47. Buzzer trên GPIO42 phát xen kẽ khoảng 1,7 và 2,3 kHz khi cảnh báo.</w:t>
+      </w:r>
+    </w:p>
+    <w:p>
+      <w:pPr>
+        <w:keepLines/>
+        <w:spacing w:before="0" w:after="140" w:line="300" w:lineRule="auto"/>
+        <w:shd w:fill="F2F2F2"/>
+        <w:pBdr>
+          <w:left w:val="single" w:sz="18" w:space="8" w:color="444444"/>
+        </w:pBdr>
+        <w:ind w:left="173" w:right="115"/>
+      </w:pPr>
+      <w:r>
+        <w:rPr>
+          <w:rFonts w:ascii="Calibri" w:hAnsi="Calibri" w:eastAsia="Calibri"/>
+          <w:b/>
+          <w:i w:val="0"/>
+          <w:color w:val="111111"/>
+          <w:sz w:val="22"/>
+        </w:rPr>
+        <w:t xml:space="preserve">Điểm cần nhấn: </w:t>
+      </w:r>
+      <w:r>
+        <w:rPr>
+          <w:rFonts w:ascii="Calibri" w:hAnsi="Calibri" w:eastAsia="Calibri"/>
+          <w:b w:val="0"/>
+          <w:i w:val="0"/>
+          <w:color w:val="111111"/>
+          <w:sz w:val="22"/>
+        </w:rPr>
+        <w:t>Phân biệt thông số của linh kiện với cấu hình thực tế đang được firmware sử dụng.</w:t>
       </w:r>
     </w:p>
     <w:p>
@@ -772,14 +803,14 @@
           <w:color w:val="111111"/>
           <w:sz w:val="22"/>
         </w:rPr>
-        <w:t>Sau khi kết nối phần cứng, vấn đề tiếp theo là làm sao cho mọi khối chạy đồng thời mà không chặn nhau.</w:t>
+        <w:t>Các thông số này được điều khiển bằng những driver do nhóm tự triển khai, em xin trình bày ở slide tiếp theo.</w:t>
       </w:r>
     </w:p>
     <w:p>
       <w:pPr>
         <w:pStyle w:val="Heading1"/>
         <w:keepNext/>
-        <w:pageBreakBefore w:val="0"/>
+        <w:pageBreakBefore/>
       </w:pPr>
       <w:r>
         <w:rPr>
@@ -789,7 +820,123 @@
           <w:color w:val="111111"/>
           <w:sz w:val="32"/>
         </w:rPr>
-        <w:t>Slide 6 — Vòng lặp không chặn giữ dữ liệu và web hoạt động đồng thời</w:t>
+        <w:t>Slide 6 — Các driver và thuật toán chính đều do nhóm tự viết</w:t>
+      </w:r>
+    </w:p>
+    <w:p>
+      <w:pPr>
+        <w:keepNext/>
+        <w:spacing w:after="120"/>
+      </w:pPr>
+      <w:r>
+        <w:rPr>
+          <w:rFonts w:ascii="Calibri" w:hAnsi="Calibri" w:eastAsia="Calibri"/>
+          <w:b/>
+          <w:i w:val="0"/>
+          <w:color w:val="696969"/>
+          <w:sz w:val="19"/>
+        </w:rPr>
+        <w:t>Thời lượng gợi ý: 60–75 giây</w:t>
+      </w:r>
+    </w:p>
+    <w:p>
+      <w:pPr>
+        <w:keepLines/>
+        <w:spacing w:before="0" w:after="140" w:line="300" w:lineRule="auto"/>
+      </w:pPr>
+      <w:r>
+        <w:rPr>
+          <w:rFonts w:ascii="Calibri" w:hAnsi="Calibri" w:eastAsia="Calibri"/>
+          <w:b/>
+          <w:i w:val="0"/>
+          <w:color w:val="111111"/>
+          <w:sz w:val="22"/>
+        </w:rPr>
+        <w:t xml:space="preserve">Lời nói gợi ý: </w:t>
+      </w:r>
+      <w:r>
+        <w:rPr>
+          <w:rFonts w:ascii="Calibri" w:hAnsi="Calibri" w:eastAsia="Calibri"/>
+          <w:b w:val="0"/>
+          <w:i w:val="0"/>
+          <w:color w:val="111111"/>
+          <w:sz w:val="22"/>
+        </w:rPr>
+        <w:t>Theo yêu cầu không sử dụng thư viện cảm biến có sẵn, nhóm chỉ dùng Arduino Core, Wire, HardwareSerial, WiFi và WiFiUDP như lớp nền truy cập phần cứng. Nhóm tự viết hàm đọc ghi thanh ghi I2C, đọc FIFO MAX30102, framebuffer và font cho OLED, đọc sáu byte gia tốc, PWM buzzer, gom chuỗi UART, checksum và parser NMEA. Ở lớp xử lý, nhóm tự xây dựng bộ lọc IIR, ngưỡng thích nghi, tính RR, ratio-of-ratios, bộ đếm bước và máy trạng thái té ngã. Ở lớp mạng, nhóm tự ghép gói DNS wildcard, phân tích request HTTP, định tuyến API, tạo JSON và giao diện HTML lưu trong flash. Vì vậy từng kết quả đều có thể truy ngược về thuật toán và mã nguồn của nhóm.</w:t>
+      </w:r>
+    </w:p>
+    <w:p>
+      <w:pPr>
+        <w:keepLines/>
+        <w:spacing w:before="0" w:after="140" w:line="300" w:lineRule="auto"/>
+        <w:shd w:fill="F2F2F2"/>
+        <w:pBdr>
+          <w:left w:val="single" w:sz="18" w:space="8" w:color="444444"/>
+        </w:pBdr>
+        <w:ind w:left="173" w:right="115"/>
+      </w:pPr>
+      <w:r>
+        <w:rPr>
+          <w:rFonts w:ascii="Calibri" w:hAnsi="Calibri" w:eastAsia="Calibri"/>
+          <w:b/>
+          <w:i w:val="0"/>
+          <w:color w:val="111111"/>
+          <w:sz w:val="22"/>
+        </w:rPr>
+        <w:t xml:space="preserve">Điểm cần nhấn: </w:t>
+      </w:r>
+      <w:r>
+        <w:rPr>
+          <w:rFonts w:ascii="Calibri" w:hAnsi="Calibri" w:eastAsia="Calibri"/>
+          <w:b w:val="0"/>
+          <w:i w:val="0"/>
+          <w:color w:val="111111"/>
+          <w:sz w:val="22"/>
+        </w:rPr>
+        <w:t>Nếu giảng viên hỏi 'tự viết đến đâu', hãy nêu đủ ba lớp: driver phần cứng, thuật toán và dịch vụ mạng.</w:t>
+      </w:r>
+    </w:p>
+    <w:p>
+      <w:pPr>
+        <w:keepLines/>
+        <w:spacing w:before="0" w:after="140" w:line="300" w:lineRule="auto"/>
+      </w:pPr>
+      <w:r>
+        <w:rPr>
+          <w:rFonts w:ascii="Calibri" w:hAnsi="Calibri" w:eastAsia="Calibri"/>
+          <w:b/>
+          <w:i/>
+          <w:color w:val="111111"/>
+          <w:sz w:val="22"/>
+        </w:rPr>
+        <w:t xml:space="preserve">Chuyển slide: </w:t>
+      </w:r>
+      <w:r>
+        <w:rPr>
+          <w:rFonts w:ascii="Calibri" w:hAnsi="Calibri" w:eastAsia="Calibri"/>
+          <w:b w:val="0"/>
+          <w:i/>
+          <w:color w:val="111111"/>
+          <w:sz w:val="22"/>
+        </w:rPr>
+        <w:t>Để các driver này chạy đồng thời, firmware được tổ chức theo vòng lặp không chặn.</w:t>
+      </w:r>
+    </w:p>
+    <w:p>
+      <w:pPr>
+        <w:pStyle w:val="Heading1"/>
+        <w:keepNext/>
+        <w:pageBreakBefore/>
+      </w:pPr>
+      <w:r>
+        <w:rPr>
+          <w:rFonts w:ascii="Calibri" w:hAnsi="Calibri" w:eastAsia="Calibri"/>
+          <w:b/>
+          <w:i w:val="0"/>
+          <w:color w:val="111111"/>
+          <w:sz w:val="32"/>
+        </w:rPr>
+        <w:t>Slide 7 — Vòng lặp không chặn giữ dữ liệu và web hoạt động đồng thời</w:t>
       </w:r>
     </w:p>
     <w:p>
@@ -831,7 +978,7 @@
           <w:color w:val="111111"/>
           <w:sz w:val="22"/>
         </w:rPr>
-        <w:t>Firmware sử dụng các mốc millis thay cho delay dài. PPG được lấy mẫu ở 100 Hz, OLED làm mới ở 10 Hz và dashboard hỏi dữ liệu ở 4 Hz. Trong mỗi vòng lặp, chương trình phục vụ DNS và HTTP, đọc GPS liên tục, lấy dữ liệu FIFO của MAX30102, rồi mới thực hiện IMU, OLED và kiểm tra phục hồi theo đúng chu kỳ. Log USB chỉ được ghi khi Serial Monitor thật sự kết nối, nên việc đóng cửa sổ debug không còn ảnh hưởng tới nhịp đọc cảm biến. Đây là điều kiện quan trọng để khoảng thời gian RR không bị sai lệch.</w:t>
+        <w:t>Firmware sử dụng các mốc millis thay cho delay dài. PPG được đưa vào thuật toán ở 100 Hz, IMU đọc 50 Hz, OLED làm mới 10 Hz và dashboard hỏi dữ liệu 4 Hz. Trong mỗi vòng lặp, chương trình phục vụ DNS và HTTP, đọc GPS liên tục, lấy FIFO MAX30102, rồi chạy các tác vụ theo đúng mốc thời gian. Mỗi mô-đun có trạng thái lỗi và cơ chế phục hồi riêng. Đặc biệt, mỗi lần đặt tay mới firmware tự làm sạch MAX30102 và FIFO; nếu sau 3,5 giây chưa có BPM, bộ dò và phần cứng tự khởi tạo lại mà không cần mở Serial Monitor.</w:t>
       </w:r>
     </w:p>
     <w:p>
@@ -905,7 +1052,7 @@
           <w:color w:val="111111"/>
           <w:sz w:val="32"/>
         </w:rPr>
-        <w:t>Slide 7 — Xử lý PPG: từ RED/IR đến BPM và SpO₂</w:t>
+        <w:t>Slide 8 — PPG tự lọc RED/IR rồi xác nhận BPM theo khoảng RR</w:t>
       </w:r>
     </w:p>
     <w:p>
@@ -921,7 +1068,7 @@
           <w:color w:val="696969"/>
           <w:sz w:val="19"/>
         </w:rPr>
-        <w:t>Thời lượng gợi ý: 80–100 giây</w:t>
+        <w:t>Thời lượng gợi ý: 90–110 giây</w:t>
       </w:r>
     </w:p>
     <w:p>
@@ -947,7 +1094,7 @@
           <w:color w:val="111111"/>
           <w:sz w:val="22"/>
         </w:rPr>
-        <w:t>Đây là phần em phụ trách chính. MAX30102 được cấu hình ở 100 mẫu mỗi giây; mỗi mẫu gồm RED và IR 18 bit đọc trực tiếp từ FIFO. Khi nhận ngón tay, bộ lọc bám nhanh đường nền trong 0,35 giây để loại xung lớn lúc vừa chạm. Sau đó em tách DC và AC bằng IIR, tạo ngưỡng thích nghi và theo dõi song song cả cạnh dương lẫn cạnh âm để không bị sai khi dạng sóng đảo cực tính. Hai cạnh trái dấu cho BPM sơ bộ dưới một giây; cạnh cùng cực tính kế tiếp tạo khoảng RR đầy đủ theo công thức BPM bằng 60.000 chia cho thời gian mili giây. SpO₂ dùng tỷ số giữa AC trên DC của kênh RED và IR trong cửa sổ 64 mẫu. Giá trị trên slide là kết quả nguyên mẫu; firmware mới ưu tiên ổn định nên kết quả đầu thường xuất hiện xấp xỉ một giây. SpO₂ chưa được hiệu chuẩn bằng thiết bị y tế nên nhóm chỉ xem đây là giá trị ước lượng.</w:t>
+        <w:t>Đây là phần em phụ trách chính. MAX30102 dùng ADC 18 bit, tốc độ ADC 400 Hz, trung bình bốn mẫu trong chip để giảm nhiễu và tạo luồng FIFO hiệu dụng 100 Hz. Độ rộng xung LED là 411 micro giây, dòng LED khoảng 10 miliampe và dải ADC 4.096 nanoampe. Khi nhận ngón tay, firmware làm sạch cảm biến cho phiên mới rồi bám nhanh đường nền 350 mili giây để loại xung đặt tay. Sau đó em tách DC và AC bằng IIR, tạo đường bao và ngưỡng thích nghi bằng 0,55 lần đường bao, đồng thời theo dõi cả hai cực tính. BPM sơ bộ được tính từ nửa chu kỳ; kết quả xác nhận dùng công thức BPM bằng 60.000 chia delta t RR, miền hợp lệ 40 đến 180 BPM. Giá trị xác nhận được làm mượt theo tỷ lệ 90 phần trăm cũ và 10 phần trăm mới. SpO₂ dùng RMS của AC chia DC trên hai kênh RED và IR trong cửa sổ 64 mẫu, sau đó áp dụng ratio-of-ratios. Đây vẫn là ước lượng nguyên mẫu, chưa được hiệu chuẩn y tế.</w:t>
       </w:r>
     </w:p>
     <w:p>
@@ -978,7 +1125,7 @@
           <w:color w:val="111111"/>
           <w:sz w:val="22"/>
         </w:rPr>
-        <w:t>Nếu bị hỏi về thư viện: khẳng định nhóm tự viết đọc FIFO, IIR, ngưỡng thích nghi, dò cạnh, khoảng trơ và ratio-of-ratios; chỉ dùng thành phần nền của Arduino Core để truy cập phần cứng.</w:t>
+        <w:t>Nhớ các số chính: ADC 400 Hz chia trung bình 4 còn 100 Hz; bám nền 350 ms; cửa sổ SpO₂ 64 mẫu.</w:t>
       </w:r>
     </w:p>
     <w:p>
@@ -1021,7 +1168,7 @@
           <w:color w:val="111111"/>
           <w:sz w:val="32"/>
         </w:rPr>
-        <w:t>Slide 8 — IMU phục vụ đếm bước và máy trạng thái té ngã</w:t>
+        <w:t>Slide 9 — IMU phục vụ đếm bước và máy trạng thái té ngã</w:t>
       </w:r>
     </w:p>
     <w:p>
@@ -1037,7 +1184,7 @@
           <w:color w:val="696969"/>
           <w:sz w:val="19"/>
         </w:rPr>
-        <w:t>Thời lượng gợi ý: 50–60 giây</w:t>
+        <w:t>Thời lượng gợi ý: 65–75 giây</w:t>
       </w:r>
     </w:p>
     <w:p>
@@ -1063,7 +1210,7 @@
           <w:color w:val="111111"/>
           <w:sz w:val="22"/>
         </w:rPr>
-        <w:t>Với đếm bước, nhóm tách trọng lực khỏi gia tốc động, yêu cầu một đáy âm rồi một đỉnh lớn hơn 0,11g và chỉ nhận chu kỳ từ 280 đến 1.800 mili giây. Hai đỉnh liên tiếp hợp lệ mới bắt đầu cộng để tránh rung đơn lẻ. Phát hiện té ngã dùng máy trạng thái gồm NORMAL, FREEFALL, IMPACT và ALERT. Chỉ khi đủ chuỗi rơi tự do, va đập và ít chuyển động thì buzzer mới cảnh báo; nếu thiếu bất kỳ điều kiện nào, hệ thống quay về NORMAL. Cách này giảm báo giả so với việc chỉ dùng một ngưỡng gia tốc.</w:t>
+        <w:t>Với đếm bước, nhóm dùng IIR hệ số 0,03 để ước lượng trọng lực và hệ số 0,25 để làm mượt gia tốc động. Một bước phải có đáy nhỏ hơn âm 0,05g rồi đỉnh lớn hơn 0,11g, khoảng cách hai đỉnh từ 280 đến 1.800 mili giây và tổng gia tốc dưới 1,8g. Hai đỉnh liên tiếp mới xác nhận chuỗi đi bộ. Phát hiện té ngã là máy trạng thái NORMAL, FREEFALL, IMPACT và ALERT: rơi tự do dưới 0,45g ít nhất 120 mili giây; sau đó va đập trên 2,2g, hoặc trên 2,8g có thể vào thẳng IMPACT. Sau 1,8 giây, nếu thiết bị gần như đứng yên, motion nhỏ hơn 0,08 và gia tốc trở về 0,72 đến 1,28g thì mới phát cảnh báo. Nếu không đủ điều kiện trong 5 giây, hệ thống về NORMAL.</w:t>
       </w:r>
     </w:p>
     <w:p>
@@ -1106,7 +1253,7 @@
           <w:color w:val="111111"/>
           <w:sz w:val="32"/>
         </w:rPr>
-        <w:t>Slide 9 — GPS chỉ nhận câu NMEA vượt qua checksum</w:t>
+        <w:t>Slide 10 — GPS chỉ nhận câu NMEA vượt qua checksum</w:t>
       </w:r>
     </w:p>
     <w:p>
@@ -1122,7 +1269,7 @@
           <w:color w:val="696969"/>
           <w:sz w:val="19"/>
         </w:rPr>
-        <w:t>Thời lượng gợi ý: 45–55 giây</w:t>
+        <w:t>Thời lượng gợi ý: 55–65 giây</w:t>
       </w:r>
     </w:p>
     <w:p>
@@ -1148,7 +1295,7 @@
           <w:color w:val="111111"/>
           <w:sz w:val="22"/>
         </w:rPr>
-        <w:t>GPS gửi dữ liệu NMEA qua UART ở 9.600 baud. Nhóm tự tính XOR phần thân câu và so sánh với checksum ở cuối câu; câu sai bị loại trước khi tách trường. Trạng thái được chia thành WAIT khi chưa có dữ liệu, NOFIX khi có UART nhưng chưa định vị, FIX khi đã có tọa độ và LOST khi quá ba giây không nhận byte. GGA và RMC cung cấp vị trí cùng số vệ tinh. Dashboard chỉ mở liên kết bản đồ khi đã có tọa độ hợp lệ, tránh đưa người dùng tới một vị trí rỗng hoặc sai.</w:t>
+        <w:t>GPS gửi NMEA qua UART ở 9.600 baud. Nhóm tự gom ký tự từ dấu đô-la đến hết dòng, tính XOR phần thân và so sánh checksum; câu sai bị loại trước khi parser tách trường. GGA cung cấp chất lượng fix, số vệ tinh và tọa độ; RMC cho biết dữ liệu đang hợp lệ A hay không hợp lệ V. WAIT nghĩa là chưa nhận byte, NOFIX nghĩa là UART vẫn chạy nhưng chưa đủ vệ tinh, FIX là đã có tọa độ và LOST là quá ba giây không nhận dữ liệu. Vì vậy SAT bằng không không đồng nghĩa hỏng dây; chỉ khi BYTE ngừng tăng và chuyển LOST mới nghi ngờ UART hoặc nguồn GPS.</w:t>
       </w:r>
     </w:p>
     <w:p>
@@ -1191,7 +1338,7 @@
           <w:color w:val="111111"/>
           <w:sz w:val="32"/>
         </w:rPr>
-        <w:t>Slide 10 — Dashboard hiển thị toàn bộ trạng thái trên một màn hình</w:t>
+        <w:t>Slide 11 — Dashboard hiển thị toàn bộ trạng thái trên một màn hình</w:t>
       </w:r>
     </w:p>
     <w:p>
@@ -1276,7 +1423,7 @@
           <w:color w:val="111111"/>
           <w:sz w:val="32"/>
         </w:rPr>
-        <w:t>Slide 11 — Luồng dữ liệu từ cảm biến đến dashboard</w:t>
+        <w:t>Slide 12 — Luồng dữ liệu từ cảm biến đến dashboard</w:t>
       </w:r>
     </w:p>
     <w:p>
@@ -1318,7 +1465,7 @@
           <w:color w:val="111111"/>
           <w:sz w:val="22"/>
         </w:rPr>
-        <w:t>Tất cả cảm biến cập nhật vào một cấu trúc trạng thái dùng chung. Khi trình duyệt gọi đường dẫn api/status, ESP32-S3 tạo JSON từ trạng thái tại đúng thời điểm yêu cầu; JavaScript cập nhật giao diện mỗi 0,25 giây. Các thao tác đặt lại bước hoặc hủy cảnh báo được gửi bằng POST rồi phản ánh lại ngay trong JSON kế tiếp. Kết quả của đồ án là một ESP32-S3 vừa duy trì PPG 100 Hz, OLED 10 Hz và dashboard 4 Hz, vừa xử lý GPS, IMU và cảnh báo mà không dùng trì hoãn dài. Hạn chế chính là SpO₂ vẫn cần hiệu chuẩn với thiết bị y tế và các thuật toán vận động cần thử nghiệm thực tế nhiều hơn. Em xin cảm ơn thầy và các bạn đã lắng nghe. Nhóm em sẵn sàng trả lời câu hỏi.</w:t>
+        <w:t>Tất cả cảm biến cập nhật vào một cấu trúc trạng thái dùng chung. Khi trình duyệt gọi api/status, parser HTTP tự viết định tuyến yêu cầu và tạo JSON tại đúng thời điểm đó; JavaScript cập nhật giao diện mỗi 0,25 giây. DNS wildcard giúp captive portal trỏ về 192.168.4.1, còn POST dùng để đặt lại bước hoặc hủy cảnh báo. Kết quả của đồ án là một ESP32-S3 vừa duy trì PPG 100 Hz, IMU 50 Hz, OLED 10 Hz và dashboard 4 Hz, vừa xử lý GPS và cảnh báo. Toàn bộ driver cảm biến, thuật toán và lớp dịch vụ ứng dụng đều do nhóm tự viết trên nền Arduino Core. Hạn chế chính là SpO₂ chưa hiệu chuẩn y tế và thuật toán vận động cần thử nghiệm trên nhiều tình huống hơn. Em xin cảm ơn thầy và các bạn đã lắng nghe.</w:t>
       </w:r>
     </w:p>
     <w:p>
@@ -1560,7 +1707,7 @@
           <w:color w:val="464646"/>
           <w:sz w:val="26"/>
         </w:rPr>
-        <w:t>6. Vì sao đóng Serial Monitor trước đây làm BPM khó xuất hiện?</w:t>
+        <w:t>6. Vì sao mở Serial Monitor làm cảm biến có vẻ nhạy hơn?</w:t>
       </w:r>
     </w:p>
     <w:p>
@@ -1575,7 +1722,7 @@
           <w:color w:val="111111"/>
           <w:sz w:val="22"/>
         </w:rPr>
-        <w:t>Firmware từng ghi log USB định kỳ ngay cả khi máy tính không đọc, có thể ảnh hưởng lịch đọc FIFO. Bản hiện tại chỉ ghi khi CDC kết nối; khi Serial đóng, đo PPG vẫn chạy độc lập và đã được kiểm tra thực tế.</w:t>
+        <w:t>Việc mở monitor có thể làm ESP32-S3 khởi động lại và vô tình làm sạch MAX30102, FIFO cùng máy trạng thái. Firmware hiện tại chủ động thực hiện bước làm sạch riêng MAX30102 cho từng lần đặt tay và tự khởi tạo lại nếu quá 3,5 giây chưa có BPM, nên không còn phụ thuộc monitor.</w:t>
       </w:r>
     </w:p>
     <w:p>
@@ -1605,7 +1752,7 @@
           <w:color w:val="111111"/>
           <w:sz w:val="22"/>
         </w:rPr>
-        <w:t>Khi IR dưới ngưỡng nhả liên tục 1,2 giây, firmware xóa toàn bộ cờ hợp lệ, BPM, SpO₂ và trạng thái bộ lọc. Phiên đo mới luôn bắt đầu lại, không dùng cache của người trước.</w:t>
+        <w:t>Hụt tín hiệu dưới 180 mili giây được xem là rung tay. Rút rồi đặt lại từ 180 mili giây sẽ mở phiên mới; mất liên tục 450 mili giây xác nhận kết thúc phiên. Firmware xóa cờ hợp lệ, BPM, SpO₂, bộ lọc và làm sạch FIFO, nên không dùng cache của người trước.</w:t>
       </w:r>
     </w:p>
     <w:p>
@@ -1699,7 +1846,7 @@
           <w:color w:val="111111"/>
           <w:sz w:val="22"/>
         </w:rPr>
-        <w:t>Nhớ ba con số: PPG 100 Hz, OLED 10 Hz, dashboard 4 Hz.</w:t>
+        <w:t>Nhớ bốn nhịp: PPG 100 Hz, IMU 50 Hz, OLED 10 Hz, dashboard 4 Hz.</w:t>
       </w:r>
     </w:p>
     <w:p>
@@ -1725,7 +1872,7 @@
           <w:color w:val="111111"/>
           <w:sz w:val="22"/>
         </w:rPr>
-        <w:t>Nhớ công thức BPM = 60.000 / Δt(ms) và giới hạn SpO₂ chưa hiệu chuẩn.</w:t>
+        <w:t>Nhớ cấu hình MAX30102: ADC 400 Hz, trung bình 4 mẫu, FIFO hiệu dụng 100 Hz.</w:t>
       </w:r>
     </w:p>
     <w:p>
@@ -1751,6 +1898,32 @@
           <w:color w:val="111111"/>
           <w:sz w:val="22"/>
         </w:rPr>
+        <w:t>Nhớ công thức BPM = 60.000 / Δt(ms) và giới hạn SpO₂ chưa hiệu chuẩn.</w:t>
+      </w:r>
+    </w:p>
+    <w:p>
+      <w:pPr>
+        <w:spacing w:after="100" w:line="300" w:lineRule="auto"/>
+        <w:ind w:left="518" w:hanging="288"/>
+      </w:pPr>
+      <w:r>
+        <w:rPr>
+          <w:rFonts w:ascii="Calibri" w:hAnsi="Calibri" w:eastAsia="Calibri"/>
+          <w:b/>
+          <w:i w:val="0"/>
+          <w:color w:val="111111"/>
+          <w:sz w:val="22"/>
+        </w:rPr>
+        <w:t xml:space="preserve">6. </w:t>
+      </w:r>
+      <w:r>
+        <w:rPr>
+          <w:rFonts w:ascii="Calibri" w:hAnsi="Calibri" w:eastAsia="Calibri"/>
+          <w:b w:val="0"/>
+          <w:i w:val="0"/>
+          <w:color w:val="111111"/>
+          <w:sz w:val="22"/>
+        </w:rPr>
         <w:t>Không khẳng định đây là thiết bị y tế; gọi đúng là nguyên mẫu đồ án.</w:t>
       </w:r>
     </w:p>
@@ -1767,7 +1940,7 @@
           <w:color w:val="111111"/>
           <w:sz w:val="22"/>
         </w:rPr>
-        <w:t xml:space="preserve">6. </w:t>
+        <w:t xml:space="preserve">7. </w:t>
       </w:r>
       <w:r>
         <w:rPr>
@@ -1823,7 +1996,7 @@
           <w:color w:val="111111"/>
           <w:sz w:val="22"/>
         </w:rPr>
-        <w:t>Nhóm em xây dựng một nguyên mẫu ESP32-S3 tích hợp MAX30102, IMU, GPS, OLED, buzzer và dashboard Wi-Fi cục bộ. Firmware tự đọc FIFO PPG 100 Hz, xử lý BPM và SpO₂, đồng thời đếm bước, phát hiện té ngã và xác minh checksum NMEA. Dữ liệu được dùng chung cho OLED và API JSON cập nhật 4 lần mỗi giây. Các driver, bộ lọc, máy trạng thái, DNS, HTTP và giao diện đều do nhóm tự viết. Hệ thống đã hoạt động đồng thời; hạn chế còn lại là SpO₂ chưa hiệu chuẩn y tế và các thuật toán vận động cần thử nghiệm thực tế nhiều hơn.</w:t>
+        <w:t>Nhóm em xây dựng nguyên mẫu ESP32-S3 N16R8 tích hợp MAX30102, IMU, GPS, OLED, buzzer và dashboard Wi-Fi cục bộ. MAX30102 lấy ADC 400 Hz, trung bình bốn mẫu để tạo FIFO 100 Hz; firmware tự lọc RED/IR, tính RR, BPM và SpO₂. IMU 50 Hz phục vụ bước và máy trạng thái té ngã; GPS được xác minh checksum NMEA. Dữ liệu dùng chung cho OLED 10 Hz và API JSON 4 Hz. Driver cảm biến, bộ lọc, máy trạng thái, DNS, HTTP và giao diện đều do nhóm tự viết. Hạn chế còn lại là SpO₂ chưa hiệu chuẩn y tế và thuật toán vận động cần thử nghiệm thực tế nhiều hơn.</w:t>
       </w:r>
     </w:p>
     <w:p>

</xml_diff>

<commit_message>
docs: focus presentation on design and results
</commit_message>
<xml_diff>
--- a/output/docs/kich_ban_thuyet_trinh_ho_si_phu.docx
+++ b/output/docs/kich_ban_thuyet_trinh_ho_si_phu.docx
@@ -99,7 +99,7 @@
                 <w:color w:val="111111"/>
                 <w:sz w:val="21"/>
               </w:rPr>
-              <w:t>Khoảng 10–12 phút</w:t>
+              <w:t>Khoảng 10 phút</w:t>
             </w:r>
           </w:p>
         </w:tc>
@@ -139,7 +139,7 @@
                 <w:color w:val="111111"/>
                 <w:sz w:val="21"/>
               </w:rPr>
-              <w:t>MAX30102, BPM, SpO₂</w:t>
+              <w:t>Thiết kế và kết quả</w:t>
             </w:r>
           </w:p>
         </w:tc>
@@ -293,6 +293,7 @@
         <w:pStyle w:val="Heading1"/>
         <w:keepNext/>
         <w:pageBreakBefore w:val="0"/>
+        <w:jc w:val="left"/>
       </w:pPr>
       <w:r>
         <w:rPr>
@@ -302,7 +303,7 @@
           <w:color w:val="111111"/>
           <w:sz w:val="32"/>
         </w:rPr>
-        <w:t>Slide 1 — Thiết bị đeo theo dõi sức khỏe, phát hiện té ngã và định vị</w:t>
+        <w:t>Slide 1 — Thiết bị theo dõi sức khỏe, phát hiện té ngã và định vị</w:t>
       </w:r>
     </w:p>
     <w:p>
@@ -318,7 +319,7 @@
           <w:color w:val="696969"/>
           <w:sz w:val="19"/>
         </w:rPr>
-        <w:t>Thời lượng gợi ý: 35–45 giây</w:t>
+        <w:t>Thời lượng gợi ý: 30–40 giây</w:t>
       </w:r>
     </w:p>
     <w:p>
@@ -344,38 +345,7 @@
           <w:color w:val="111111"/>
           <w:sz w:val="22"/>
         </w:rPr>
-        <w:t>Kính chào thầy và các bạn. Em là Hồ Sĩ Phú, đại diện nhóm trình bày đồ án thiết bị đeo theo dõi sức khỏe sử dụng ESP32-S3. Hệ thống kết hợp đo nhịp tim, ước lượng SpO₂, đếm bước, phát hiện té ngã, định vị GPS và giao diện theo dõi qua Wi-Fi cục bộ. Mục tiêu của nhóm là xây dựng một nguyên mẫu hoạt động đồng thời, không phụ thuộc Internet và đặc biệt là tự viết các khối xử lý chính thay vì dùng thư viện thuật toán có sẵn.</w:t>
-      </w:r>
-    </w:p>
-    <w:p>
-      <w:pPr>
-        <w:keepLines/>
-        <w:spacing w:before="0" w:after="140" w:line="300" w:lineRule="auto"/>
-        <w:shd w:fill="F2F2F2"/>
-        <w:pBdr>
-          <w:left w:val="single" w:sz="18" w:space="8" w:color="444444"/>
-        </w:pBdr>
-        <w:ind w:left="173" w:right="115"/>
-      </w:pPr>
-      <w:r>
-        <w:rPr>
-          <w:rFonts w:ascii="Calibri" w:hAnsi="Calibri" w:eastAsia="Calibri"/>
-          <w:b/>
-          <w:i w:val="0"/>
-          <w:color w:val="111111"/>
-          <w:sz w:val="22"/>
-        </w:rPr>
-        <w:t xml:space="preserve">Điểm cần nhấn: </w:t>
-      </w:r>
-      <w:r>
-        <w:rPr>
-          <w:rFonts w:ascii="Calibri" w:hAnsi="Calibri" w:eastAsia="Calibri"/>
-          <w:b w:val="0"/>
-          <w:i w:val="0"/>
-          <w:color w:val="111111"/>
-          <w:sz w:val="22"/>
-        </w:rPr>
-        <w:t>Giới thiệu đủ ba mục tiêu: theo dõi sức khỏe, an toàn khi té ngã và định vị.</w:t>
+        <w:t>Kính chào thầy và các bạn. Em là Hồ Sĩ Phú, đại diện nhóm trình bày nguyên mẫu theo dõi sức khỏe dùng ESP32-S3. Trong khoảng mười phút, em tập trung vào ba nội dung: thiết kế hệ thống, các thuật toán do nhóm tự viết và kết quả chạy trên phần cứng thực tế.</w:t>
       </w:r>
     </w:p>
     <w:p>
@@ -401,7 +371,7 @@
           <w:color w:val="111111"/>
           <w:sz w:val="22"/>
         </w:rPr>
-        <w:t>Trước hết, em xin giới thiệu cách toàn bộ các chức năng được hợp nhất trên một nền tảng.</w:t>
+        <w:t>Trước tiên là nguyên mẫu nhóm đã lắp và vận hành trên breadboard.</w:t>
       </w:r>
     </w:p>
     <w:p>
@@ -409,6 +379,7 @@
         <w:pStyle w:val="Heading1"/>
         <w:keepNext/>
         <w:pageBreakBefore w:val="0"/>
+        <w:jc w:val="left"/>
       </w:pPr>
       <w:r>
         <w:rPr>
@@ -418,92 +389,7 @@
           <w:color w:val="111111"/>
           <w:sz w:val="32"/>
         </w:rPr>
-        <w:t>Slide 2 — Một nền tảng hợp nhất các chức năng của thiết bị đeo</w:t>
-      </w:r>
-    </w:p>
-    <w:p>
-      <w:pPr>
-        <w:keepNext/>
-        <w:spacing w:after="120"/>
-      </w:pPr>
-      <w:r>
-        <w:rPr>
-          <w:rFonts w:ascii="Calibri" w:hAnsi="Calibri" w:eastAsia="Calibri"/>
-          <w:b/>
-          <w:i w:val="0"/>
-          <w:color w:val="696969"/>
-          <w:sz w:val="19"/>
-        </w:rPr>
-        <w:t>Thời lượng gợi ý: 40–50 giây</w:t>
-      </w:r>
-    </w:p>
-    <w:p>
-      <w:pPr>
-        <w:keepLines/>
-        <w:spacing w:before="0" w:after="140" w:line="300" w:lineRule="auto"/>
-      </w:pPr>
-      <w:r>
-        <w:rPr>
-          <w:rFonts w:ascii="Calibri" w:hAnsi="Calibri" w:eastAsia="Calibri"/>
-          <w:b/>
-          <w:i w:val="0"/>
-          <w:color w:val="111111"/>
-          <w:sz w:val="22"/>
-        </w:rPr>
-        <w:t xml:space="preserve">Lời nói gợi ý: </w:t>
-      </w:r>
-      <w:r>
-        <w:rPr>
-          <w:rFonts w:ascii="Calibri" w:hAnsi="Calibri" w:eastAsia="Calibri"/>
-          <w:b w:val="0"/>
-          <w:i w:val="0"/>
-          <w:color w:val="111111"/>
-          <w:sz w:val="22"/>
-        </w:rPr>
-        <w:t>ESP32-S3 đóng vai trò điều phối trung tâm. MAX30102 cung cấp hai kênh quang RED và IR để xử lý nhịp tim và SpO₂. IMU cung cấp gia tốc cho đếm bước và phát hiện té ngã. GPS cung cấp vị trí; OLED hiển thị tại chỗ; buzzer phát cảnh báo; còn dashboard Wi-Fi cho phép xem toàn bộ trạng thái bằng điện thoại hoặc máy tính. Điểm quan trọng là các khối không chạy tách rời mà cùng cập nhật vào một trạng thái dùng chung, nhờ đó OLED và giao diện web luôn nhận cùng một dữ liệu.</w:t>
-      </w:r>
-    </w:p>
-    <w:p>
-      <w:pPr>
-        <w:keepLines/>
-        <w:spacing w:before="0" w:after="140" w:line="300" w:lineRule="auto"/>
-      </w:pPr>
-      <w:r>
-        <w:rPr>
-          <w:rFonts w:ascii="Calibri" w:hAnsi="Calibri" w:eastAsia="Calibri"/>
-          <w:b/>
-          <w:i/>
-          <w:color w:val="111111"/>
-          <w:sz w:val="22"/>
-        </w:rPr>
-        <w:t xml:space="preserve">Chuyển slide: </w:t>
-      </w:r>
-      <w:r>
-        <w:rPr>
-          <w:rFonts w:ascii="Calibri" w:hAnsi="Calibri" w:eastAsia="Calibri"/>
-          <w:b w:val="0"/>
-          <w:i/>
-          <w:color w:val="111111"/>
-          <w:sz w:val="22"/>
-        </w:rPr>
-        <w:t>Ngoài màn hình trên thiết bị, nhóm còn mở rộng hệ thống bằng một giao diện Wi-Fi cục bộ.</w:t>
-      </w:r>
-    </w:p>
-    <w:p>
-      <w:pPr>
-        <w:pStyle w:val="Heading1"/>
-        <w:keepNext/>
-        <w:pageBreakBefore/>
-      </w:pPr>
-      <w:r>
-        <w:rPr>
-          <w:rFonts w:ascii="Calibri" w:hAnsi="Calibri" w:eastAsia="Calibri"/>
-          <w:b/>
-          <w:i w:val="0"/>
-          <w:color w:val="111111"/>
-          <w:sz w:val="32"/>
-        </w:rPr>
-        <w:t>Slide 3 — Phạm vi mới: truy cập toàn bộ hệ thống qua Wi-Fi cục bộ</w:t>
+        <w:t>Slide 2 — Nguyên mẫu hoạt động trên breadboard</w:t>
       </w:r>
     </w:p>
     <w:p>
@@ -545,7 +431,7 @@
           <w:color w:val="111111"/>
           <w:sz w:val="22"/>
         </w:rPr>
-        <w:t>Thiết bị tự phát mạng Wi-Fi tên health-monitor, mật khẩu 99999999 và địa chỉ truy cập là 192.168.4.1. Người dùng không cần router hoặc Internet. Khi kết nối, captive portal có thể tự mở dashboard; nếu không, người dùng nhập địa chỉ trên trình duyệt. API JSON được cập nhật mỗi 0,25 giây và giao diện cho phép xem số đo, trạng thái cảm biến, vị trí GPS, đồng thời đặt lại số bước hoặc hủy cảnh báo té ngã. Phần DNS, HTTP, định tuyến và giao diện đều được nhóm tự viết và lưu trong flash của ESP32-S3.</w:t>
+        <w:t>Đây là ảnh sản phẩm thật của nhóm. ESP32-S3 kết nối đồng thời OLED, MAX30102, IMU, GPS và buzzer. Trong ảnh, người dùng đang đặt ngón tay lên MAX30102 và OLED nhận dữ liệu từ firmware. Các số trên màn hình chỉ là trạng thái tại thời điểm chụp, không dùng làm số liệu hiệu chuẩn. Nguyên mẫu thực hiện sáu nhóm chức năng: BPM, SpO₂, đếm bước, phát hiện té ngã, định vị và dashboard Wi-Fi.</w:t>
       </w:r>
     </w:p>
     <w:p>
@@ -576,7 +462,7 @@
           <w:color w:val="111111"/>
           <w:sz w:val="22"/>
         </w:rPr>
-        <w:t>Đọc rõ tên Wi-Fi, mật khẩu và địa chỉ IP; không đọc đường dẫn GitHub.</w:t>
+        <w:t>Chỉ vào đúng các mô-đun trên ảnh; không dành thời gian mô tả từng dây nối.</w:t>
       </w:r>
     </w:p>
     <w:p>
@@ -602,14 +488,15 @@
           <w:color w:val="111111"/>
           <w:sz w:val="22"/>
         </w:rPr>
-        <w:t>Để thấy dữ liệu đi như thế nào, slide tiếp theo trình bày kiến trúc tổng thể.</w:t>
+        <w:t>Để các khối này chạy đồng thời, nhóm thiết kế ESP32-S3 làm trung tâm điều phối.</w:t>
       </w:r>
     </w:p>
     <w:p>
       <w:pPr>
         <w:pStyle w:val="Heading1"/>
         <w:keepNext/>
-        <w:pageBreakBefore w:val="0"/>
+        <w:pageBreakBefore/>
+        <w:jc w:val="left"/>
       </w:pPr>
       <w:r>
         <w:rPr>
@@ -619,7 +506,444 @@
           <w:color w:val="111111"/>
           <w:sz w:val="32"/>
         </w:rPr>
-        <w:t>Slide 4 — ESP32-S3 là trung tâm của kiến trúc</w:t>
+        <w:t>Slide 3 — ESP32-S3 là trung tâm thiết kế phần cứng</w:t>
+      </w:r>
+    </w:p>
+    <w:p>
+      <w:pPr>
+        <w:keepNext/>
+        <w:spacing w:after="120"/>
+      </w:pPr>
+      <w:r>
+        <w:rPr>
+          <w:rFonts w:ascii="Calibri" w:hAnsi="Calibri" w:eastAsia="Calibri"/>
+          <w:b/>
+          <w:i w:val="0"/>
+          <w:color w:val="696969"/>
+          <w:sz w:val="19"/>
+        </w:rPr>
+        <w:t>Thời lượng gợi ý: 55–65 giây</w:t>
+      </w:r>
+    </w:p>
+    <w:p>
+      <w:pPr>
+        <w:keepLines/>
+        <w:spacing w:before="0" w:after="140" w:line="300" w:lineRule="auto"/>
+      </w:pPr>
+      <w:r>
+        <w:rPr>
+          <w:rFonts w:ascii="Calibri" w:hAnsi="Calibri" w:eastAsia="Calibri"/>
+          <w:b/>
+          <w:i w:val="0"/>
+          <w:color w:val="111111"/>
+          <w:sz w:val="22"/>
+        </w:rPr>
+        <w:t xml:space="preserve">Lời nói gợi ý: </w:t>
+      </w:r>
+      <w:r>
+        <w:rPr>
+          <w:rFonts w:ascii="Calibri" w:hAnsi="Calibri" w:eastAsia="Calibri"/>
+          <w:b w:val="0"/>
+          <w:i w:val="0"/>
+          <w:color w:val="111111"/>
+          <w:sz w:val="22"/>
+        </w:rPr>
+        <w:t>ESP32-S3 N16R8 chạy 240 MHz, có 16 MB flash và 8 MB PSRAM. Ba thiết bị I2C dùng chung GPIO8 và GPIO9: OLED địa chỉ 0x3C, MAX30102 địa chỉ 0x57 và IMU địa chỉ 0x68. GPS tách sang UART1 tại RX21, TX47; buzzer dùng GPIO42. Firmware xử lý PPG 100 Hz, IMU 50 Hz, OLED 10 Hz và dashboard 4 Hz bằng lịch millis không chặn. Vì tất cả kết quả cập nhật vào một trạng thái dùng chung nên OLED và web luôn hiển thị cùng dữ liệu.</w:t>
+      </w:r>
+    </w:p>
+    <w:p>
+      <w:pPr>
+        <w:keepLines/>
+        <w:spacing w:before="0" w:after="140" w:line="300" w:lineRule="auto"/>
+        <w:shd w:fill="F2F2F2"/>
+        <w:pBdr>
+          <w:left w:val="single" w:sz="18" w:space="8" w:color="444444"/>
+        </w:pBdr>
+        <w:ind w:left="173" w:right="115"/>
+      </w:pPr>
+      <w:r>
+        <w:rPr>
+          <w:rFonts w:ascii="Calibri" w:hAnsi="Calibri" w:eastAsia="Calibri"/>
+          <w:b/>
+          <w:i w:val="0"/>
+          <w:color w:val="111111"/>
+          <w:sz w:val="22"/>
+        </w:rPr>
+        <w:t xml:space="preserve">Điểm cần nhấn: </w:t>
+      </w:r>
+      <w:r>
+        <w:rPr>
+          <w:rFonts w:ascii="Calibri" w:hAnsi="Calibri" w:eastAsia="Calibri"/>
+          <w:b w:val="0"/>
+          <w:i w:val="0"/>
+          <w:color w:val="111111"/>
+          <w:sz w:val="22"/>
+        </w:rPr>
+        <w:t>Nhấn mạnh kiến trúc và nhịp tác vụ; bỏ qua các thông số phụ nếu sắp hết giờ.</w:t>
+      </w:r>
+    </w:p>
+    <w:p>
+      <w:pPr>
+        <w:keepLines/>
+        <w:spacing w:before="0" w:after="140" w:line="300" w:lineRule="auto"/>
+      </w:pPr>
+      <w:r>
+        <w:rPr>
+          <w:rFonts w:ascii="Calibri" w:hAnsi="Calibri" w:eastAsia="Calibri"/>
+          <w:b/>
+          <w:i/>
+          <w:color w:val="111111"/>
+          <w:sz w:val="22"/>
+        </w:rPr>
+        <w:t xml:space="preserve">Chuyển slide: </w:t>
+      </w:r>
+      <w:r>
+        <w:rPr>
+          <w:rFonts w:ascii="Calibri" w:hAnsi="Calibri" w:eastAsia="Calibri"/>
+          <w:b w:val="0"/>
+          <w:i/>
+          <w:color w:val="111111"/>
+          <w:sz w:val="22"/>
+        </w:rPr>
+        <w:t>Trên cấu hình phần cứng đó, nhóm tự viết toàn bộ lớp xử lý ứng dụng.</w:t>
+      </w:r>
+    </w:p>
+    <w:p>
+      <w:pPr>
+        <w:pStyle w:val="Heading1"/>
+        <w:keepNext/>
+        <w:pageBreakBefore w:val="0"/>
+        <w:jc w:val="left"/>
+      </w:pPr>
+      <w:r>
+        <w:rPr>
+          <w:rFonts w:ascii="Calibri" w:hAnsi="Calibri" w:eastAsia="Calibri"/>
+          <w:b/>
+          <w:i w:val="0"/>
+          <w:color w:val="111111"/>
+          <w:sz w:val="32"/>
+        </w:rPr>
+        <w:t>Slide 4 — Tự viết từ driver đến thuật toán và giao diện</w:t>
+      </w:r>
+    </w:p>
+    <w:p>
+      <w:pPr>
+        <w:keepNext/>
+        <w:spacing w:after="120"/>
+      </w:pPr>
+      <w:r>
+        <w:rPr>
+          <w:rFonts w:ascii="Calibri" w:hAnsi="Calibri" w:eastAsia="Calibri"/>
+          <w:b/>
+          <w:i w:val="0"/>
+          <w:color w:val="696969"/>
+          <w:sz w:val="19"/>
+        </w:rPr>
+        <w:t>Thời lượng gợi ý: 60–70 giây</w:t>
+      </w:r>
+    </w:p>
+    <w:p>
+      <w:pPr>
+        <w:keepLines/>
+        <w:spacing w:before="0" w:after="140" w:line="300" w:lineRule="auto"/>
+      </w:pPr>
+      <w:r>
+        <w:rPr>
+          <w:rFonts w:ascii="Calibri" w:hAnsi="Calibri" w:eastAsia="Calibri"/>
+          <w:b/>
+          <w:i w:val="0"/>
+          <w:color w:val="111111"/>
+          <w:sz w:val="22"/>
+        </w:rPr>
+        <w:t xml:space="preserve">Lời nói gợi ý: </w:t>
+      </w:r>
+      <w:r>
+        <w:rPr>
+          <w:rFonts w:ascii="Calibri" w:hAnsi="Calibri" w:eastAsia="Calibri"/>
+          <w:b w:val="0"/>
+          <w:i w:val="0"/>
+          <w:color w:val="111111"/>
+          <w:sz w:val="22"/>
+        </w:rPr>
+        <w:t>Theo yêu cầu không dùng thư viện cảm biến có sẵn, nhóm chỉ dùng Arduino Core, Wire, HardwareSerial, WiFi và WiFiUDP làm lớp nền phần cứng. Nhóm tự viết driver I2C và FIFO MAX30102, framebuffer và font OLED, đọc gia tốc, PWM buzzer và gom UART. Nhóm cũng tự viết bộ lọc IIR, ngưỡng thích nghi, RR, ratio-of-ratios, đếm bước, máy trạng thái té ngã, checksum NMEA, DNS, HTTP, router JSON và dashboard trong flash. Nhờ vậy từng kết quả đều giải thích được trực tiếp từ mã nguồn của nhóm.</w:t>
+      </w:r>
+    </w:p>
+    <w:p>
+      <w:pPr>
+        <w:keepLines/>
+        <w:spacing w:before="0" w:after="140" w:line="300" w:lineRule="auto"/>
+        <w:shd w:fill="F2F2F2"/>
+        <w:pBdr>
+          <w:left w:val="single" w:sz="18" w:space="8" w:color="444444"/>
+        </w:pBdr>
+        <w:ind w:left="173" w:right="115"/>
+      </w:pPr>
+      <w:r>
+        <w:rPr>
+          <w:rFonts w:ascii="Calibri" w:hAnsi="Calibri" w:eastAsia="Calibri"/>
+          <w:b/>
+          <w:i w:val="0"/>
+          <w:color w:val="111111"/>
+          <w:sz w:val="22"/>
+        </w:rPr>
+        <w:t xml:space="preserve">Điểm cần nhấn: </w:t>
+      </w:r>
+      <w:r>
+        <w:rPr>
+          <w:rFonts w:ascii="Calibri" w:hAnsi="Calibri" w:eastAsia="Calibri"/>
+          <w:b w:val="0"/>
+          <w:i w:val="0"/>
+          <w:color w:val="111111"/>
+          <w:sz w:val="22"/>
+        </w:rPr>
+        <w:t>Nếu giảng viên hỏi tự viết đến đâu, trả lời theo ba lớp: driver, thuật toán và dịch vụ.</w:t>
+      </w:r>
+    </w:p>
+    <w:p>
+      <w:pPr>
+        <w:keepLines/>
+        <w:spacing w:before="0" w:after="140" w:line="300" w:lineRule="auto"/>
+      </w:pPr>
+      <w:r>
+        <w:rPr>
+          <w:rFonts w:ascii="Calibri" w:hAnsi="Calibri" w:eastAsia="Calibri"/>
+          <w:b/>
+          <w:i/>
+          <w:color w:val="111111"/>
+          <w:sz w:val="22"/>
+        </w:rPr>
+        <w:t xml:space="preserve">Chuyển slide: </w:t>
+      </w:r>
+      <w:r>
+        <w:rPr>
+          <w:rFonts w:ascii="Calibri" w:hAnsi="Calibri" w:eastAsia="Calibri"/>
+          <w:b w:val="0"/>
+          <w:i/>
+          <w:color w:val="111111"/>
+          <w:sz w:val="22"/>
+        </w:rPr>
+        <w:t>Thuật toán quan trọng nhất của phần em phụ trách là xử lý PPG để tạo BPM và SpO₂.</w:t>
+      </w:r>
+    </w:p>
+    <w:p>
+      <w:pPr>
+        <w:pStyle w:val="Heading1"/>
+        <w:keepNext/>
+        <w:pageBreakBefore/>
+        <w:jc w:val="left"/>
+      </w:pPr>
+      <w:r>
+        <w:rPr>
+          <w:rFonts w:ascii="Calibri" w:hAnsi="Calibri" w:eastAsia="Calibri"/>
+          <w:b/>
+          <w:i w:val="0"/>
+          <w:color w:val="111111"/>
+          <w:sz w:val="32"/>
+        </w:rPr>
+        <w:t>Slide 5 — PPG: kết quả sớm, xác nhận bằng khoảng RR</w:t>
+      </w:r>
+    </w:p>
+    <w:p>
+      <w:pPr>
+        <w:keepNext/>
+        <w:spacing w:after="120"/>
+      </w:pPr>
+      <w:r>
+        <w:rPr>
+          <w:rFonts w:ascii="Calibri" w:hAnsi="Calibri" w:eastAsia="Calibri"/>
+          <w:b/>
+          <w:i w:val="0"/>
+          <w:color w:val="696969"/>
+          <w:sz w:val="19"/>
+        </w:rPr>
+        <w:t>Thời lượng gợi ý: 85–95 giây</w:t>
+      </w:r>
+    </w:p>
+    <w:p>
+      <w:pPr>
+        <w:keepLines/>
+        <w:spacing w:before="0" w:after="140" w:line="300" w:lineRule="auto"/>
+      </w:pPr>
+      <w:r>
+        <w:rPr>
+          <w:rFonts w:ascii="Calibri" w:hAnsi="Calibri" w:eastAsia="Calibri"/>
+          <w:b/>
+          <w:i w:val="0"/>
+          <w:color w:val="111111"/>
+          <w:sz w:val="22"/>
+        </w:rPr>
+        <w:t xml:space="preserve">Lời nói gợi ý: </w:t>
+      </w:r>
+      <w:r>
+        <w:rPr>
+          <w:rFonts w:ascii="Calibri" w:hAnsi="Calibri" w:eastAsia="Calibri"/>
+          <w:b w:val="0"/>
+          <w:i w:val="0"/>
+          <w:color w:val="111111"/>
+          <w:sz w:val="22"/>
+        </w:rPr>
+        <w:t>Đây là phần em phụ trách chính. MAX30102 lấy mẫu ADC 400 Hz và trung bình bốn mẫu trong phần cứng để tạo luồng RED, IR 100 Hz. Khi đặt tay, firmware bám nhanh đường nền 350 mili giây, sau đó tách DC và AC bằng IIR, tạo ngưỡng thích nghi và theo dõi cả hai cực tính của sóng. Hai cạnh trái dấu cho BPM sơ bộ dưới một giây; cạnh cùng cực tính kế tiếp tạo RR đầy đủ để tính BPM bằng 60.000 chia delta t, xác nhận không quá 1,75 giây trong phép thử tổng hợp. SpO₂ dùng ratio-of-ratios từ RMS AC chia DC của RED và IR trên cửa sổ 64 mẫu, có thể xuất từ khoảng 0,76 giây. SpO₂ vẫn là giá trị nguyên mẫu, chưa hiệu chuẩn y tế.</w:t>
+      </w:r>
+    </w:p>
+    <w:p>
+      <w:pPr>
+        <w:keepLines/>
+        <w:spacing w:before="0" w:after="140" w:line="300" w:lineRule="auto"/>
+        <w:shd w:fill="F2F2F2"/>
+        <w:pBdr>
+          <w:left w:val="single" w:sz="18" w:space="8" w:color="444444"/>
+        </w:pBdr>
+        <w:ind w:left="173" w:right="115"/>
+      </w:pPr>
+      <w:r>
+        <w:rPr>
+          <w:rFonts w:ascii="Calibri" w:hAnsi="Calibri" w:eastAsia="Calibri"/>
+          <w:b/>
+          <w:i w:val="0"/>
+          <w:color w:val="111111"/>
+          <w:sz w:val="22"/>
+        </w:rPr>
+        <w:t xml:space="preserve">Điểm cần nhấn: </w:t>
+      </w:r>
+      <w:r>
+        <w:rPr>
+          <w:rFonts w:ascii="Calibri" w:hAnsi="Calibri" w:eastAsia="Calibri"/>
+          <w:b w:val="0"/>
+          <w:i w:val="0"/>
+          <w:color w:val="111111"/>
+          <w:sz w:val="22"/>
+        </w:rPr>
+        <w:t>Nhớ ba mốc: BPM sơ bộ dưới 1 giây, xác nhận không quá 1,75 giây, SpO₂ từ khoảng 0,76 giây.</w:t>
+      </w:r>
+    </w:p>
+    <w:p>
+      <w:pPr>
+        <w:keepLines/>
+        <w:spacing w:before="0" w:after="140" w:line="300" w:lineRule="auto"/>
+      </w:pPr>
+      <w:r>
+        <w:rPr>
+          <w:rFonts w:ascii="Calibri" w:hAnsi="Calibri" w:eastAsia="Calibri"/>
+          <w:b/>
+          <w:i/>
+          <w:color w:val="111111"/>
+          <w:sz w:val="22"/>
+        </w:rPr>
+        <w:t xml:space="preserve">Chuyển slide: </w:t>
+      </w:r>
+      <w:r>
+        <w:rPr>
+          <w:rFonts w:ascii="Calibri" w:hAnsi="Calibri" w:eastAsia="Calibri"/>
+          <w:b w:val="0"/>
+          <w:i/>
+          <w:color w:val="111111"/>
+          <w:sz w:val="22"/>
+        </w:rPr>
+        <w:t>Ngoài tín hiệu quang, IMU và GPS cũng dùng chuỗi điều kiện để tránh phản ứng sai do nhiễu.</w:t>
+      </w:r>
+    </w:p>
+    <w:p>
+      <w:pPr>
+        <w:pStyle w:val="Heading1"/>
+        <w:keepNext/>
+        <w:pageBreakBefore w:val="0"/>
+        <w:jc w:val="left"/>
+      </w:pPr>
+      <w:r>
+        <w:rPr>
+          <w:rFonts w:ascii="Calibri" w:hAnsi="Calibri" w:eastAsia="Calibri"/>
+          <w:b/>
+          <w:i w:val="0"/>
+          <w:color w:val="111111"/>
+          <w:sz w:val="32"/>
+        </w:rPr>
+        <w:t>Slide 6 — IMU và GPS dùng chuỗi điều kiện lọc nhiễu</w:t>
+      </w:r>
+    </w:p>
+    <w:p>
+      <w:pPr>
+        <w:keepNext/>
+        <w:spacing w:after="120"/>
+      </w:pPr>
+      <w:r>
+        <w:rPr>
+          <w:rFonts w:ascii="Calibri" w:hAnsi="Calibri" w:eastAsia="Calibri"/>
+          <w:b/>
+          <w:i w:val="0"/>
+          <w:color w:val="696969"/>
+          <w:sz w:val="19"/>
+        </w:rPr>
+        <w:t>Thời lượng gợi ý: 65–75 giây</w:t>
+      </w:r>
+    </w:p>
+    <w:p>
+      <w:pPr>
+        <w:keepLines/>
+        <w:spacing w:before="0" w:after="140" w:line="300" w:lineRule="auto"/>
+      </w:pPr>
+      <w:r>
+        <w:rPr>
+          <w:rFonts w:ascii="Calibri" w:hAnsi="Calibri" w:eastAsia="Calibri"/>
+          <w:b/>
+          <w:i w:val="0"/>
+          <w:color w:val="111111"/>
+          <w:sz w:val="22"/>
+        </w:rPr>
+        <w:t xml:space="preserve">Lời nói gợi ý: </w:t>
+      </w:r>
+      <w:r>
+        <w:rPr>
+          <w:rFonts w:ascii="Calibri" w:hAnsi="Calibri" w:eastAsia="Calibri"/>
+          <w:b w:val="0"/>
+          <w:i w:val="0"/>
+          <w:color w:val="111111"/>
+          <w:sz w:val="22"/>
+        </w:rPr>
+        <w:t>Đếm bước yêu cầu tín hiệu đi từ đáy sang đỉnh, chu kỳ từ 280 đến 1.800 mili giây và phải có hai đỉnh liên tiếp mới xác nhận đi bộ. Té ngã dùng chuỗi NORMAL, FREEFALL, IMPACT rồi bất động; thiếu một điều kiện thì hệ thống quay về NORMAL, tránh báo động bởi một va chạm đơn lẻ. Với GPS, nhóm tự gom câu GGA và RMC, kiểm tra checksum XOR rồi mới tách dữ liệu. NOFIX nghĩa là UART vẫn chạy nhưng chưa có vị trí; LOST chỉ xuất hiện khi quá ba giây không nhận byte.</w:t>
+      </w:r>
+    </w:p>
+    <w:p>
+      <w:pPr>
+        <w:keepLines/>
+        <w:spacing w:before="0" w:after="140" w:line="300" w:lineRule="auto"/>
+      </w:pPr>
+      <w:r>
+        <w:rPr>
+          <w:rFonts w:ascii="Calibri" w:hAnsi="Calibri" w:eastAsia="Calibri"/>
+          <w:b/>
+          <w:i/>
+          <w:color w:val="111111"/>
+          <w:sz w:val="22"/>
+        </w:rPr>
+        <w:t xml:space="preserve">Chuyển slide: </w:t>
+      </w:r>
+      <w:r>
+        <w:rPr>
+          <w:rFonts w:ascii="Calibri" w:hAnsi="Calibri" w:eastAsia="Calibri"/>
+          <w:b w:val="0"/>
+          <w:i/>
+          <w:color w:val="111111"/>
+          <w:sz w:val="22"/>
+        </w:rPr>
+        <w:t>Sau khi xử lý, toàn bộ trạng thái được đưa lên giao diện web cục bộ.</w:t>
+      </w:r>
+    </w:p>
+    <w:p>
+      <w:pPr>
+        <w:pStyle w:val="Heading1"/>
+        <w:keepNext/>
+        <w:pageBreakBefore/>
+        <w:jc w:val="left"/>
+      </w:pPr>
+      <w:r>
+        <w:rPr>
+          <w:rFonts w:ascii="Calibri" w:hAnsi="Calibri" w:eastAsia="Calibri"/>
+          <w:b/>
+          <w:i w:val="0"/>
+          <w:color w:val="111111"/>
+          <w:sz w:val="32"/>
+        </w:rPr>
+        <w:t>Slide 7 — Dashboard hiển thị toàn bộ trạng thái</w:t>
       </w:r>
     </w:p>
     <w:p>
@@ -661,7 +985,7 @@
           <w:color w:val="111111"/>
           <w:sz w:val="22"/>
         </w:rPr>
-        <w:t>Sơ đồ cho thấy ba nguồn dữ liệu chính đi vào ESP32-S3: PPG từ MAX30102, gia tốc từ IMU và NMEA từ GPS. Vi điều khiển tự xử lý BPM, SpO₂, bước, té ngã và vị trí rồi phân phối kết quả cho OLED, buzzer, Serial và dashboard. Nhóm không dùng WebServer hoặc thư viện xử lý tín hiệu hoàn chỉnh; thay vào đó, các driver I2C, parser NMEA, bộ lọc và giao thức HTTP được triển khai trực tiếp trong mã nguồn. Cách tổ chức này giúp nhóm kiểm soát được thời gian xử lý và giải thích rõ từng khối khi kiểm tra.</w:t>
+        <w:t>ESP32-S3 tự phát Wi-Fi health-monitor, mật khẩu 99999999, địa chỉ 192.168.4.1 và không cần Internet. Dashboard lấy JSON mỗi 0,25 giây để hiển thị BPM, SpO₂, bước, té ngã, GPS và tình trạng cảm biến. Hai thao tác web cho phép đặt lại số bước và hủy cảnh báo. DNS captive portal, parser HTTP, router, JSON và giao diện đều do nhóm tự viết, không dùng WebServer hay DNSServer có sẵn.</w:t>
       </w:r>
     </w:p>
     <w:p>
@@ -687,14 +1011,15 @@
           <w:color w:val="111111"/>
           <w:sz w:val="22"/>
         </w:rPr>
-        <w:t>Kiến trúc logic này được ánh xạ xuống các giao tiếp phần cứng như sau.</w:t>
+        <w:t>Các phép thử tích hợp cho thấy toàn bộ chuỗi này đã hoạt động trên cùng firmware.</w:t>
       </w:r>
     </w:p>
     <w:p>
       <w:pPr>
         <w:pStyle w:val="Heading1"/>
         <w:keepNext/>
-        <w:pageBreakBefore/>
+        <w:pageBreakBefore w:val="0"/>
+        <w:jc w:val="left"/>
       </w:pPr>
       <w:r>
         <w:rPr>
@@ -704,7 +1029,7 @@
           <w:color w:val="111111"/>
           <w:sz w:val="32"/>
         </w:rPr>
-        <w:t>Slide 5 — Thông số cơ bản được chọn theo đúng cấu hình firmware</w:t>
+        <w:t>Slide 8 — Kết quả: toàn bộ chuỗi tích hợp đã hoạt động</w:t>
       </w:r>
     </w:p>
     <w:p>
@@ -720,7 +1045,7 @@
           <w:color w:val="696969"/>
           <w:sz w:val="19"/>
         </w:rPr>
-        <w:t>Thời lượng gợi ý: 55–65 giây</w:t>
+        <w:t>Thời lượng gợi ý: 60–70 giây</w:t>
       </w:r>
     </w:p>
     <w:p>
@@ -746,7 +1071,7 @@
           <w:color w:val="111111"/>
           <w:sz w:val="22"/>
         </w:rPr>
-        <w:t>ESP32-S3 N16R8 chạy tối đa 240 MHz, có 16 MB flash và 8 MB PSRAM. OLED SSD1306 có độ phân giải 128 nhân 64, địa chỉ 0x3C và được cập nhật 10 lần mỗi giây. MAX30102 ở địa chỉ 0x57, ADC 18 bit; ADC lấy 400 mẫu mỗi giây rồi trung bình bốn mẫu trong phần cứng, vì vậy FIFO đưa cho thuật toán đúng 100 mẫu mỗi giây. IMU dùng địa chỉ 0x68, thang cộng trừ 2g, bộ lọc số khoảng 44 Hz và được đọc ở 50 Hz. GPS dùng UART1 9.600 baud tại RX21, TX47. Buzzer trên GPIO42 phát xen kẽ khoảng 1,7 và 2,3 kHz khi cảnh báo.</w:t>
+        <w:t>Khi kiểm tra, hệ thống nhận đủ ba địa chỉ I2C 0x3C, 0x57 và 0x68. BPM thực tế quan sát khoảng 72 đến 83 qua các lần thử; bộ dò vẫn khôi phục được khi dạng sóng PPG bị đảo. GPS đã bắt FIX với bốn vệ tinh ở lần chạy cuối. OLED, buzzer, Wi-Fi AP, dashboard và hai lệnh điều khiển web đều chạy trong cùng firmware. Các ca tự kiểm tra cũng xác nhận 20 chu kỳ bước cho 20 bước và chuỗi té ngã đầy đủ đi vào ALERT. Chương trình dùng khoảng 30 phần trăm flash và 15 phần trăm RAM toàn cục.</w:t>
       </w:r>
     </w:p>
     <w:p>
@@ -777,7 +1102,7 @@
           <w:color w:val="111111"/>
           <w:sz w:val="22"/>
         </w:rPr>
-        <w:t>Phân biệt thông số của linh kiện với cấu hình thực tế đang được firmware sử dụng.</w:t>
+        <w:t>Phân biệt rõ kết quả phần cứng thật với phép thử mô phỏng thuật toán.</w:t>
       </w:r>
     </w:p>
     <w:p>
@@ -803,7 +1128,7 @@
           <w:color w:val="111111"/>
           <w:sz w:val="22"/>
         </w:rPr>
-        <w:t>Các thông số này được điều khiển bằng những driver do nhóm tự triển khai, em xin trình bày ở slide tiếp theo.</w:t>
+        <w:t>Từ các kết quả đó, nhóm đánh giá nguyên mẫu đã đạt mục tiêu học thuật nhưng vẫn còn các bước hiệu chuẩn.</w:t>
       </w:r>
     </w:p>
     <w:p>
@@ -811,6 +1136,7 @@
         <w:pStyle w:val="Heading1"/>
         <w:keepNext/>
         <w:pageBreakBefore/>
+        <w:jc w:val="left"/>
       </w:pPr>
       <w:r>
         <w:rPr>
@@ -820,123 +1146,7 @@
           <w:color w:val="111111"/>
           <w:sz w:val="32"/>
         </w:rPr>
-        <w:t>Slide 6 — Các driver và thuật toán chính đều do nhóm tự viết</w:t>
-      </w:r>
-    </w:p>
-    <w:p>
-      <w:pPr>
-        <w:keepNext/>
-        <w:spacing w:after="120"/>
-      </w:pPr>
-      <w:r>
-        <w:rPr>
-          <w:rFonts w:ascii="Calibri" w:hAnsi="Calibri" w:eastAsia="Calibri"/>
-          <w:b/>
-          <w:i w:val="0"/>
-          <w:color w:val="696969"/>
-          <w:sz w:val="19"/>
-        </w:rPr>
-        <w:t>Thời lượng gợi ý: 60–75 giây</w:t>
-      </w:r>
-    </w:p>
-    <w:p>
-      <w:pPr>
-        <w:keepLines/>
-        <w:spacing w:before="0" w:after="140" w:line="300" w:lineRule="auto"/>
-      </w:pPr>
-      <w:r>
-        <w:rPr>
-          <w:rFonts w:ascii="Calibri" w:hAnsi="Calibri" w:eastAsia="Calibri"/>
-          <w:b/>
-          <w:i w:val="0"/>
-          <w:color w:val="111111"/>
-          <w:sz w:val="22"/>
-        </w:rPr>
-        <w:t xml:space="preserve">Lời nói gợi ý: </w:t>
-      </w:r>
-      <w:r>
-        <w:rPr>
-          <w:rFonts w:ascii="Calibri" w:hAnsi="Calibri" w:eastAsia="Calibri"/>
-          <w:b w:val="0"/>
-          <w:i w:val="0"/>
-          <w:color w:val="111111"/>
-          <w:sz w:val="22"/>
-        </w:rPr>
-        <w:t>Theo yêu cầu không sử dụng thư viện cảm biến có sẵn, nhóm chỉ dùng Arduino Core, Wire, HardwareSerial, WiFi và WiFiUDP như lớp nền truy cập phần cứng. Nhóm tự viết hàm đọc ghi thanh ghi I2C, đọc FIFO MAX30102, framebuffer và font cho OLED, đọc sáu byte gia tốc, PWM buzzer, gom chuỗi UART, checksum và parser NMEA. Ở lớp xử lý, nhóm tự xây dựng bộ lọc IIR, ngưỡng thích nghi, tính RR, ratio-of-ratios, bộ đếm bước và máy trạng thái té ngã. Ở lớp mạng, nhóm tự ghép gói DNS wildcard, phân tích request HTTP, định tuyến API, tạo JSON và giao diện HTML lưu trong flash. Vì vậy từng kết quả đều có thể truy ngược về thuật toán và mã nguồn của nhóm.</w:t>
-      </w:r>
-    </w:p>
-    <w:p>
-      <w:pPr>
-        <w:keepLines/>
-        <w:spacing w:before="0" w:after="140" w:line="300" w:lineRule="auto"/>
-        <w:shd w:fill="F2F2F2"/>
-        <w:pBdr>
-          <w:left w:val="single" w:sz="18" w:space="8" w:color="444444"/>
-        </w:pBdr>
-        <w:ind w:left="173" w:right="115"/>
-      </w:pPr>
-      <w:r>
-        <w:rPr>
-          <w:rFonts w:ascii="Calibri" w:hAnsi="Calibri" w:eastAsia="Calibri"/>
-          <w:b/>
-          <w:i w:val="0"/>
-          <w:color w:val="111111"/>
-          <w:sz w:val="22"/>
-        </w:rPr>
-        <w:t xml:space="preserve">Điểm cần nhấn: </w:t>
-      </w:r>
-      <w:r>
-        <w:rPr>
-          <w:rFonts w:ascii="Calibri" w:hAnsi="Calibri" w:eastAsia="Calibri"/>
-          <w:b w:val="0"/>
-          <w:i w:val="0"/>
-          <w:color w:val="111111"/>
-          <w:sz w:val="22"/>
-        </w:rPr>
-        <w:t>Nếu giảng viên hỏi 'tự viết đến đâu', hãy nêu đủ ba lớp: driver phần cứng, thuật toán và dịch vụ mạng.</w:t>
-      </w:r>
-    </w:p>
-    <w:p>
-      <w:pPr>
-        <w:keepLines/>
-        <w:spacing w:before="0" w:after="140" w:line="300" w:lineRule="auto"/>
-      </w:pPr>
-      <w:r>
-        <w:rPr>
-          <w:rFonts w:ascii="Calibri" w:hAnsi="Calibri" w:eastAsia="Calibri"/>
-          <w:b/>
-          <w:i/>
-          <w:color w:val="111111"/>
-          <w:sz w:val="22"/>
-        </w:rPr>
-        <w:t xml:space="preserve">Chuyển slide: </w:t>
-      </w:r>
-      <w:r>
-        <w:rPr>
-          <w:rFonts w:ascii="Calibri" w:hAnsi="Calibri" w:eastAsia="Calibri"/>
-          <w:b w:val="0"/>
-          <w:i/>
-          <w:color w:val="111111"/>
-          <w:sz w:val="22"/>
-        </w:rPr>
-        <w:t>Để các driver này chạy đồng thời, firmware được tổ chức theo vòng lặp không chặn.</w:t>
-      </w:r>
-    </w:p>
-    <w:p>
-      <w:pPr>
-        <w:pStyle w:val="Heading1"/>
-        <w:keepNext/>
-        <w:pageBreakBefore/>
-      </w:pPr>
-      <w:r>
-        <w:rPr>
-          <w:rFonts w:ascii="Calibri" w:hAnsi="Calibri" w:eastAsia="Calibri"/>
-          <w:b/>
-          <w:i w:val="0"/>
-          <w:color w:val="111111"/>
-          <w:sz w:val="32"/>
-        </w:rPr>
-        <w:t>Slide 7 — Vòng lặp không chặn giữ dữ liệu và web hoạt động đồng thời</w:t>
+        <w:t>Slide 9 — Kết luận và hướng phát triển</w:t>
       </w:r>
     </w:p>
     <w:p>
@@ -978,7 +1188,7 @@
           <w:color w:val="111111"/>
           <w:sz w:val="22"/>
         </w:rPr>
-        <w:t>Firmware sử dụng các mốc millis thay cho delay dài. PPG được đưa vào thuật toán ở 100 Hz, IMU đọc 50 Hz, OLED làm mới 10 Hz và dashboard hỏi dữ liệu 4 Hz. Trong mỗi vòng lặp, chương trình phục vụ DNS và HTTP, đọc GPS liên tục, lấy FIFO MAX30102, rồi chạy các tác vụ theo đúng mốc thời gian. Mỗi mô-đun có trạng thái lỗi và cơ chế phục hồi riêng. Đặc biệt, mỗi lần đặt tay mới firmware tự làm sạch MAX30102 và FIFO; nếu sau 3,5 giây chưa có BPM, bộ dò và phần cứng tự khởi tạo lại mà không cần mở Serial Monitor.</w:t>
+        <w:t>Nhóm đã tích hợp sức khỏe, vận động, GPS, cảnh báo và hai giao diện trên một ESP32-S3; đồng thời tự viết driver, thuật toán và dịch vụ ứng dụng. Hạn chế chính là SpO₂ chưa hiệu chuẩn bằng thiết bị y tế, đếm bước và té ngã cần thêm dữ liệu thử an toàn. Hướng tiếp theo là hiệu chuẩn, thiết kế PCB, quản lý pin, vỏ đeo và kênh gửi cảnh báo từ xa. Đây là nguyên mẫu nghiên cứu và học tập, chưa phải thiết bị y tế. Em xin cảm ơn thầy và các bạn đã lắng nghe.</w:t>
       </w:r>
     </w:p>
     <w:p>
@@ -1009,7 +1219,7 @@
           <w:color w:val="111111"/>
           <w:sz w:val="22"/>
         </w:rPr>
-        <w:t>Đây là câu chuyển sang phần phụ trách cá nhân của Hồ Sĩ Phú.</w:t>
+        <w:t>Kết luận ngắn: đã làm được gì, giới hạn gì và bước tiếp theo là gì.</w:t>
       </w:r>
     </w:p>
     <w:p>
@@ -1035,494 +1245,7 @@
           <w:color w:val="111111"/>
           <w:sz w:val="22"/>
         </w:rPr>
-        <w:t>Từ luồng PPG 100 Hz này, em trực tiếp xử lý RED và IR để tạo BPM và SpO₂.</w:t>
-      </w:r>
-    </w:p>
-    <w:p>
-      <w:pPr>
-        <w:pStyle w:val="Heading1"/>
-        <w:keepNext/>
-        <w:pageBreakBefore/>
-      </w:pPr>
-      <w:r>
-        <w:rPr>
-          <w:rFonts w:ascii="Calibri" w:hAnsi="Calibri" w:eastAsia="Calibri"/>
-          <w:b/>
-          <w:i w:val="0"/>
-          <w:color w:val="111111"/>
-          <w:sz w:val="32"/>
-        </w:rPr>
-        <w:t>Slide 8 — PPG tự lọc RED/IR rồi xác nhận BPM theo khoảng RR</w:t>
-      </w:r>
-    </w:p>
-    <w:p>
-      <w:pPr>
-        <w:keepNext/>
-        <w:spacing w:after="120"/>
-      </w:pPr>
-      <w:r>
-        <w:rPr>
-          <w:rFonts w:ascii="Calibri" w:hAnsi="Calibri" w:eastAsia="Calibri"/>
-          <w:b/>
-          <w:i w:val="0"/>
-          <w:color w:val="696969"/>
-          <w:sz w:val="19"/>
-        </w:rPr>
-        <w:t>Thời lượng gợi ý: 90–110 giây</w:t>
-      </w:r>
-    </w:p>
-    <w:p>
-      <w:pPr>
-        <w:keepLines/>
-        <w:spacing w:before="0" w:after="140" w:line="300" w:lineRule="auto"/>
-      </w:pPr>
-      <w:r>
-        <w:rPr>
-          <w:rFonts w:ascii="Calibri" w:hAnsi="Calibri" w:eastAsia="Calibri"/>
-          <w:b/>
-          <w:i w:val="0"/>
-          <w:color w:val="111111"/>
-          <w:sz w:val="22"/>
-        </w:rPr>
-        <w:t xml:space="preserve">Lời nói gợi ý: </w:t>
-      </w:r>
-      <w:r>
-        <w:rPr>
-          <w:rFonts w:ascii="Calibri" w:hAnsi="Calibri" w:eastAsia="Calibri"/>
-          <w:b w:val="0"/>
-          <w:i w:val="0"/>
-          <w:color w:val="111111"/>
-          <w:sz w:val="22"/>
-        </w:rPr>
-        <w:t>Đây là phần em phụ trách chính. MAX30102 dùng ADC 18 bit, tốc độ ADC 400 Hz, trung bình bốn mẫu trong chip để giảm nhiễu và tạo luồng FIFO hiệu dụng 100 Hz. Độ rộng xung LED là 411 micro giây, dòng LED khoảng 10 miliampe và dải ADC 4.096 nanoampe. Khi nhận ngón tay, firmware làm sạch cảm biến cho phiên mới rồi bám nhanh đường nền 350 mili giây để loại xung đặt tay. Sau đó em tách DC và AC bằng IIR, tạo đường bao và ngưỡng thích nghi bằng 0,55 lần đường bao, đồng thời theo dõi cả hai cực tính. BPM sơ bộ được tính từ nửa chu kỳ; kết quả xác nhận dùng công thức BPM bằng 60.000 chia delta t RR, miền hợp lệ 40 đến 180 BPM. Giá trị xác nhận được làm mượt theo tỷ lệ 90 phần trăm cũ và 10 phần trăm mới. SpO₂ dùng RMS của AC chia DC trên hai kênh RED và IR trong cửa sổ 64 mẫu, sau đó áp dụng ratio-of-ratios. Đây vẫn là ước lượng nguyên mẫu, chưa được hiệu chuẩn y tế.</w:t>
-      </w:r>
-    </w:p>
-    <w:p>
-      <w:pPr>
-        <w:keepLines/>
-        <w:spacing w:before="0" w:after="140" w:line="300" w:lineRule="auto"/>
-        <w:shd w:fill="F2F2F2"/>
-        <w:pBdr>
-          <w:left w:val="single" w:sz="18" w:space="8" w:color="444444"/>
-        </w:pBdr>
-        <w:ind w:left="173" w:right="115"/>
-      </w:pPr>
-      <w:r>
-        <w:rPr>
-          <w:rFonts w:ascii="Calibri" w:hAnsi="Calibri" w:eastAsia="Calibri"/>
-          <w:b/>
-          <w:i w:val="0"/>
-          <w:color w:val="111111"/>
-          <w:sz w:val="22"/>
-        </w:rPr>
-        <w:t xml:space="preserve">Điểm cần nhấn: </w:t>
-      </w:r>
-      <w:r>
-        <w:rPr>
-          <w:rFonts w:ascii="Calibri" w:hAnsi="Calibri" w:eastAsia="Calibri"/>
-          <w:b w:val="0"/>
-          <w:i w:val="0"/>
-          <w:color w:val="111111"/>
-          <w:sz w:val="22"/>
-        </w:rPr>
-        <w:t>Nhớ các số chính: ADC 400 Hz chia trung bình 4 còn 100 Hz; bám nền 350 ms; cửa sổ SpO₂ 64 mẫu.</w:t>
-      </w:r>
-    </w:p>
-    <w:p>
-      <w:pPr>
-        <w:keepLines/>
-        <w:spacing w:before="0" w:after="140" w:line="300" w:lineRule="auto"/>
-      </w:pPr>
-      <w:r>
-        <w:rPr>
-          <w:rFonts w:ascii="Calibri" w:hAnsi="Calibri" w:eastAsia="Calibri"/>
-          <w:b/>
-          <w:i/>
-          <w:color w:val="111111"/>
-          <w:sz w:val="22"/>
-        </w:rPr>
-        <w:t xml:space="preserve">Chuyển slide: </w:t>
-      </w:r>
-      <w:r>
-        <w:rPr>
-          <w:rFonts w:ascii="Calibri" w:hAnsi="Calibri" w:eastAsia="Calibri"/>
-          <w:b w:val="0"/>
-          <w:i/>
-          <w:color w:val="111111"/>
-          <w:sz w:val="22"/>
-        </w:rPr>
-        <w:t>Sau khối sức khỏe, hệ thống dùng IMU để theo dõi vận động và té ngã.</w:t>
-      </w:r>
-    </w:p>
-    <w:p>
-      <w:pPr>
-        <w:pStyle w:val="Heading1"/>
-        <w:keepNext/>
-        <w:pageBreakBefore/>
-      </w:pPr>
-      <w:r>
-        <w:rPr>
-          <w:rFonts w:ascii="Calibri" w:hAnsi="Calibri" w:eastAsia="Calibri"/>
-          <w:b/>
-          <w:i w:val="0"/>
-          <w:color w:val="111111"/>
-          <w:sz w:val="32"/>
-        </w:rPr>
-        <w:t>Slide 9 — IMU phục vụ đếm bước và máy trạng thái té ngã</w:t>
-      </w:r>
-    </w:p>
-    <w:p>
-      <w:pPr>
-        <w:keepNext/>
-        <w:spacing w:after="120"/>
-      </w:pPr>
-      <w:r>
-        <w:rPr>
-          <w:rFonts w:ascii="Calibri" w:hAnsi="Calibri" w:eastAsia="Calibri"/>
-          <w:b/>
-          <w:i w:val="0"/>
-          <w:color w:val="696969"/>
-          <w:sz w:val="19"/>
-        </w:rPr>
-        <w:t>Thời lượng gợi ý: 65–75 giây</w:t>
-      </w:r>
-    </w:p>
-    <w:p>
-      <w:pPr>
-        <w:keepLines/>
-        <w:spacing w:before="0" w:after="140" w:line="300" w:lineRule="auto"/>
-      </w:pPr>
-      <w:r>
-        <w:rPr>
-          <w:rFonts w:ascii="Calibri" w:hAnsi="Calibri" w:eastAsia="Calibri"/>
-          <w:b/>
-          <w:i w:val="0"/>
-          <w:color w:val="111111"/>
-          <w:sz w:val="22"/>
-        </w:rPr>
-        <w:t xml:space="preserve">Lời nói gợi ý: </w:t>
-      </w:r>
-      <w:r>
-        <w:rPr>
-          <w:rFonts w:ascii="Calibri" w:hAnsi="Calibri" w:eastAsia="Calibri"/>
-          <w:b w:val="0"/>
-          <w:i w:val="0"/>
-          <w:color w:val="111111"/>
-          <w:sz w:val="22"/>
-        </w:rPr>
-        <w:t>Với đếm bước, nhóm dùng IIR hệ số 0,03 để ước lượng trọng lực và hệ số 0,25 để làm mượt gia tốc động. Một bước phải có đáy nhỏ hơn âm 0,05g rồi đỉnh lớn hơn 0,11g, khoảng cách hai đỉnh từ 280 đến 1.800 mili giây và tổng gia tốc dưới 1,8g. Hai đỉnh liên tiếp mới xác nhận chuỗi đi bộ. Phát hiện té ngã là máy trạng thái NORMAL, FREEFALL, IMPACT và ALERT: rơi tự do dưới 0,45g ít nhất 120 mili giây; sau đó va đập trên 2,2g, hoặc trên 2,8g có thể vào thẳng IMPACT. Sau 1,8 giây, nếu thiết bị gần như đứng yên, motion nhỏ hơn 0,08 và gia tốc trở về 0,72 đến 1,28g thì mới phát cảnh báo. Nếu không đủ điều kiện trong 5 giây, hệ thống về NORMAL.</w:t>
-      </w:r>
-    </w:p>
-    <w:p>
-      <w:pPr>
-        <w:keepLines/>
-        <w:spacing w:before="0" w:after="140" w:line="300" w:lineRule="auto"/>
-      </w:pPr>
-      <w:r>
-        <w:rPr>
-          <w:rFonts w:ascii="Calibri" w:hAnsi="Calibri" w:eastAsia="Calibri"/>
-          <w:b/>
-          <w:i/>
-          <w:color w:val="111111"/>
-          <w:sz w:val="22"/>
-        </w:rPr>
-        <w:t xml:space="preserve">Chuyển slide: </w:t>
-      </w:r>
-      <w:r>
-        <w:rPr>
-          <w:rFonts w:ascii="Calibri" w:hAnsi="Calibri" w:eastAsia="Calibri"/>
-          <w:b w:val="0"/>
-          <w:i/>
-          <w:color w:val="111111"/>
-          <w:sz w:val="22"/>
-        </w:rPr>
-        <w:t>Song song với dữ liệu chuyển động, GPS được kiểm tra checksum trước khi chấp nhận vị trí.</w:t>
-      </w:r>
-    </w:p>
-    <w:p>
-      <w:pPr>
-        <w:pStyle w:val="Heading1"/>
-        <w:keepNext/>
-        <w:pageBreakBefore/>
-      </w:pPr>
-      <w:r>
-        <w:rPr>
-          <w:rFonts w:ascii="Calibri" w:hAnsi="Calibri" w:eastAsia="Calibri"/>
-          <w:b/>
-          <w:i w:val="0"/>
-          <w:color w:val="111111"/>
-          <w:sz w:val="32"/>
-        </w:rPr>
-        <w:t>Slide 10 — GPS chỉ nhận câu NMEA vượt qua checksum</w:t>
-      </w:r>
-    </w:p>
-    <w:p>
-      <w:pPr>
-        <w:keepNext/>
-        <w:spacing w:after="120"/>
-      </w:pPr>
-      <w:r>
-        <w:rPr>
-          <w:rFonts w:ascii="Calibri" w:hAnsi="Calibri" w:eastAsia="Calibri"/>
-          <w:b/>
-          <w:i w:val="0"/>
-          <w:color w:val="696969"/>
-          <w:sz w:val="19"/>
-        </w:rPr>
-        <w:t>Thời lượng gợi ý: 55–65 giây</w:t>
-      </w:r>
-    </w:p>
-    <w:p>
-      <w:pPr>
-        <w:keepLines/>
-        <w:spacing w:before="0" w:after="140" w:line="300" w:lineRule="auto"/>
-      </w:pPr>
-      <w:r>
-        <w:rPr>
-          <w:rFonts w:ascii="Calibri" w:hAnsi="Calibri" w:eastAsia="Calibri"/>
-          <w:b/>
-          <w:i w:val="0"/>
-          <w:color w:val="111111"/>
-          <w:sz w:val="22"/>
-        </w:rPr>
-        <w:t xml:space="preserve">Lời nói gợi ý: </w:t>
-      </w:r>
-      <w:r>
-        <w:rPr>
-          <w:rFonts w:ascii="Calibri" w:hAnsi="Calibri" w:eastAsia="Calibri"/>
-          <w:b w:val="0"/>
-          <w:i w:val="0"/>
-          <w:color w:val="111111"/>
-          <w:sz w:val="22"/>
-        </w:rPr>
-        <w:t>GPS gửi NMEA qua UART ở 9.600 baud. Nhóm tự gom ký tự từ dấu đô-la đến hết dòng, tính XOR phần thân và so sánh checksum; câu sai bị loại trước khi parser tách trường. GGA cung cấp chất lượng fix, số vệ tinh và tọa độ; RMC cho biết dữ liệu đang hợp lệ A hay không hợp lệ V. WAIT nghĩa là chưa nhận byte, NOFIX nghĩa là UART vẫn chạy nhưng chưa đủ vệ tinh, FIX là đã có tọa độ và LOST là quá ba giây không nhận dữ liệu. Vì vậy SAT bằng không không đồng nghĩa hỏng dây; chỉ khi BYTE ngừng tăng và chuyển LOST mới nghi ngờ UART hoặc nguồn GPS.</w:t>
-      </w:r>
-    </w:p>
-    <w:p>
-      <w:pPr>
-        <w:keepLines/>
-        <w:spacing w:before="0" w:after="140" w:line="300" w:lineRule="auto"/>
-      </w:pPr>
-      <w:r>
-        <w:rPr>
-          <w:rFonts w:ascii="Calibri" w:hAnsi="Calibri" w:eastAsia="Calibri"/>
-          <w:b/>
-          <w:i/>
-          <w:color w:val="111111"/>
-          <w:sz w:val="22"/>
-        </w:rPr>
-        <w:t xml:space="preserve">Chuyển slide: </w:t>
-      </w:r>
-      <w:r>
-        <w:rPr>
-          <w:rFonts w:ascii="Calibri" w:hAnsi="Calibri" w:eastAsia="Calibri"/>
-          <w:b w:val="0"/>
-          <w:i/>
-          <w:color w:val="111111"/>
-          <w:sz w:val="22"/>
-        </w:rPr>
-        <w:t>Các kết quả sau xử lý được gom lại và hiển thị trên dashboard như slide tiếp theo.</w:t>
-      </w:r>
-    </w:p>
-    <w:p>
-      <w:pPr>
-        <w:pStyle w:val="Heading1"/>
-        <w:keepNext/>
-        <w:pageBreakBefore w:val="0"/>
-      </w:pPr>
-      <w:r>
-        <w:rPr>
-          <w:rFonts w:ascii="Calibri" w:hAnsi="Calibri" w:eastAsia="Calibri"/>
-          <w:b/>
-          <w:i w:val="0"/>
-          <w:color w:val="111111"/>
-          <w:sz w:val="32"/>
-        </w:rPr>
-        <w:t>Slide 11 — Dashboard hiển thị toàn bộ trạng thái trên một màn hình</w:t>
-      </w:r>
-    </w:p>
-    <w:p>
-      <w:pPr>
-        <w:keepNext/>
-        <w:spacing w:after="120"/>
-      </w:pPr>
-      <w:r>
-        <w:rPr>
-          <w:rFonts w:ascii="Calibri" w:hAnsi="Calibri" w:eastAsia="Calibri"/>
-          <w:b/>
-          <w:i w:val="0"/>
-          <w:color w:val="696969"/>
-          <w:sz w:val="19"/>
-        </w:rPr>
-        <w:t>Thời lượng gợi ý: 45–55 giây</w:t>
-      </w:r>
-    </w:p>
-    <w:p>
-      <w:pPr>
-        <w:keepLines/>
-        <w:spacing w:before="0" w:after="140" w:line="300" w:lineRule="auto"/>
-      </w:pPr>
-      <w:r>
-        <w:rPr>
-          <w:rFonts w:ascii="Calibri" w:hAnsi="Calibri" w:eastAsia="Calibri"/>
-          <w:b/>
-          <w:i w:val="0"/>
-          <w:color w:val="111111"/>
-          <w:sz w:val="22"/>
-        </w:rPr>
-        <w:t xml:space="preserve">Lời nói gợi ý: </w:t>
-      </w:r>
-      <w:r>
-        <w:rPr>
-          <w:rFonts w:ascii="Calibri" w:hAnsi="Calibri" w:eastAsia="Calibri"/>
-          <w:b w:val="0"/>
-          <w:i w:val="0"/>
-          <w:color w:val="111111"/>
-          <w:sz w:val="22"/>
-        </w:rPr>
-        <w:t>Dashboard được thiết kế theo hướng tinh gọn: bốn thông tin chính là BPM, SpO₂, số bước và trạng thái té ngã nằm ở phần đầu; bên dưới là chất lượng PPG, IR thô, trạng thái GPS và tình trạng từng thiết bị. Khi BPM mới là ước lượng nửa chu kỳ, giao diện ghi rõ là BPM sơ bộ; khi đủ RR thì chuyển sang đã xác nhận. Nếu chưa có cờ hợp lệ, dashboard hiển thị dấu chờ thay vì số 0 hoặc kết quả của người đo trước. Hai nút điều khiển cho phép đặt lại bước và hủy cảnh báo ngay trong mạng cục bộ.</w:t>
-      </w:r>
-    </w:p>
-    <w:p>
-      <w:pPr>
-        <w:keepLines/>
-        <w:spacing w:before="0" w:after="140" w:line="300" w:lineRule="auto"/>
-      </w:pPr>
-      <w:r>
-        <w:rPr>
-          <w:rFonts w:ascii="Calibri" w:hAnsi="Calibri" w:eastAsia="Calibri"/>
-          <w:b/>
-          <w:i/>
-          <w:color w:val="111111"/>
-          <w:sz w:val="22"/>
-        </w:rPr>
-        <w:t xml:space="preserve">Chuyển slide: </w:t>
-      </w:r>
-      <w:r>
-        <w:rPr>
-          <w:rFonts w:ascii="Calibri" w:hAnsi="Calibri" w:eastAsia="Calibri"/>
-          <w:b w:val="0"/>
-          <w:i/>
-          <w:color w:val="111111"/>
-          <w:sz w:val="22"/>
-        </w:rPr>
-        <w:t>Slide cuối tóm tắt luồng dữ liệu giúp dashboard luôn đồng bộ với thiết bị.</w:t>
-      </w:r>
-    </w:p>
-    <w:p>
-      <w:pPr>
-        <w:pStyle w:val="Heading1"/>
-        <w:keepNext/>
-        <w:pageBreakBefore/>
-      </w:pPr>
-      <w:r>
-        <w:rPr>
-          <w:rFonts w:ascii="Calibri" w:hAnsi="Calibri" w:eastAsia="Calibri"/>
-          <w:b/>
-          <w:i w:val="0"/>
-          <w:color w:val="111111"/>
-          <w:sz w:val="32"/>
-        </w:rPr>
-        <w:t>Slide 12 — Luồng dữ liệu từ cảm biến đến dashboard</w:t>
-      </w:r>
-    </w:p>
-    <w:p>
-      <w:pPr>
-        <w:keepNext/>
-        <w:spacing w:after="120"/>
-      </w:pPr>
-      <w:r>
-        <w:rPr>
-          <w:rFonts w:ascii="Calibri" w:hAnsi="Calibri" w:eastAsia="Calibri"/>
-          <w:b/>
-          <w:i w:val="0"/>
-          <w:color w:val="696969"/>
-          <w:sz w:val="19"/>
-        </w:rPr>
-        <w:t>Thời lượng gợi ý: 55–65 giây</w:t>
-      </w:r>
-    </w:p>
-    <w:p>
-      <w:pPr>
-        <w:keepLines/>
-        <w:spacing w:before="0" w:after="140" w:line="300" w:lineRule="auto"/>
-      </w:pPr>
-      <w:r>
-        <w:rPr>
-          <w:rFonts w:ascii="Calibri" w:hAnsi="Calibri" w:eastAsia="Calibri"/>
-          <w:b/>
-          <w:i w:val="0"/>
-          <w:color w:val="111111"/>
-          <w:sz w:val="22"/>
-        </w:rPr>
-        <w:t xml:space="preserve">Lời nói gợi ý: </w:t>
-      </w:r>
-      <w:r>
-        <w:rPr>
-          <w:rFonts w:ascii="Calibri" w:hAnsi="Calibri" w:eastAsia="Calibri"/>
-          <w:b w:val="0"/>
-          <w:i w:val="0"/>
-          <w:color w:val="111111"/>
-          <w:sz w:val="22"/>
-        </w:rPr>
-        <w:t>Tất cả cảm biến cập nhật vào một cấu trúc trạng thái dùng chung. Khi trình duyệt gọi api/status, parser HTTP tự viết định tuyến yêu cầu và tạo JSON tại đúng thời điểm đó; JavaScript cập nhật giao diện mỗi 0,25 giây. DNS wildcard giúp captive portal trỏ về 192.168.4.1, còn POST dùng để đặt lại bước hoặc hủy cảnh báo. Kết quả của đồ án là một ESP32-S3 vừa duy trì PPG 100 Hz, IMU 50 Hz, OLED 10 Hz và dashboard 4 Hz, vừa xử lý GPS và cảnh báo. Toàn bộ driver cảm biến, thuật toán và lớp dịch vụ ứng dụng đều do nhóm tự viết trên nền Arduino Core. Hạn chế chính là SpO₂ chưa hiệu chuẩn y tế và thuật toán vận động cần thử nghiệm trên nhiều tình huống hơn. Em xin cảm ơn thầy và các bạn đã lắng nghe.</w:t>
-      </w:r>
-    </w:p>
-    <w:p>
-      <w:pPr>
-        <w:keepLines/>
-        <w:spacing w:before="0" w:after="140" w:line="300" w:lineRule="auto"/>
-        <w:shd w:fill="F2F2F2"/>
-        <w:pBdr>
-          <w:left w:val="single" w:sz="18" w:space="8" w:color="444444"/>
-        </w:pBdr>
-        <w:ind w:left="173" w:right="115"/>
-      </w:pPr>
-      <w:r>
-        <w:rPr>
-          <w:rFonts w:ascii="Calibri" w:hAnsi="Calibri" w:eastAsia="Calibri"/>
-          <w:b/>
-          <w:i w:val="0"/>
-          <w:color w:val="111111"/>
-          <w:sz w:val="22"/>
-        </w:rPr>
-        <w:t xml:space="preserve">Điểm cần nhấn: </w:t>
-      </w:r>
-      <w:r>
-        <w:rPr>
-          <w:rFonts w:ascii="Calibri" w:hAnsi="Calibri" w:eastAsia="Calibri"/>
-          <w:b w:val="0"/>
-          <w:i w:val="0"/>
-          <w:color w:val="111111"/>
-          <w:sz w:val="22"/>
-        </w:rPr>
-        <w:t>Kết luận phải nêu cả kết quả đã làm được và giới hạn chưa hoàn thiện.</w:t>
-      </w:r>
-    </w:p>
-    <w:p>
-      <w:pPr>
-        <w:keepLines/>
-        <w:spacing w:before="0" w:after="140" w:line="300" w:lineRule="auto"/>
-      </w:pPr>
-      <w:r>
-        <w:rPr>
-          <w:rFonts w:ascii="Calibri" w:hAnsi="Calibri" w:eastAsia="Calibri"/>
-          <w:b/>
-          <w:i/>
-          <w:color w:val="111111"/>
-          <w:sz w:val="22"/>
-        </w:rPr>
-        <w:t xml:space="preserve">Chuyển slide: </w:t>
-      </w:r>
-      <w:r>
-        <w:rPr>
-          <w:rFonts w:ascii="Calibri" w:hAnsi="Calibri" w:eastAsia="Calibri"/>
-          <w:b w:val="0"/>
-          <w:i/>
-          <w:color w:val="111111"/>
-          <w:sz w:val="22"/>
-        </w:rPr>
-        <w:t>Dừng lại, nhìn giảng viên và chờ câu hỏi; không kết thúc bằng cách quay lưng nhìn màn hình.</w:t>
+        <w:t>Dừng lại, nhìn giảng viên và chờ câu hỏi.</w:t>
       </w:r>
     </w:p>
     <w:p>

</xml_diff>

<commit_message>
docs: refine slide cover and member details
</commit_message>
<xml_diff>
--- a/output/docs/kich_ban_thuyet_trinh_ho_si_phu.docx
+++ b/output/docs/kich_ban_thuyet_trinh_ho_si_phu.docx
@@ -623,7 +623,7 @@
           <w:color w:val="111111"/>
           <w:sz w:val="32"/>
         </w:rPr>
-        <w:t>Slide 4 — Tự viết từ driver đến thuật toán và giao diện</w:t>
+        <w:t>Slide 4 — Driver đến thuật toán và giao diện</w:t>
       </w:r>
     </w:p>
     <w:p>
@@ -665,7 +665,7 @@
           <w:color w:val="111111"/>
           <w:sz w:val="22"/>
         </w:rPr>
-        <w:t>Theo yêu cầu không dùng thư viện cảm biến có sẵn, nhóm chỉ dùng Arduino Core, Wire, HardwareSerial, WiFi và WiFiUDP làm lớp nền phần cứng. Nhóm tự viết driver I2C và FIFO MAX30102, framebuffer và font OLED, đọc gia tốc, PWM buzzer và gom UART. Nhóm cũng tự viết bộ lọc IIR, ngưỡng thích nghi, RR, ratio-of-ratios, đếm bước, máy trạng thái té ngã, checksum NMEA, DNS, HTTP, router JSON và dashboard trong flash. Nhờ vậy từng kết quả đều giải thích được trực tiếp từ mã nguồn của nhóm.</w:t>
+        <w:t>Phần mềm được tổ chức thành ba lớp. Lớp driver gồm I2C và FIFO MAX30102, framebuffer và font OLED, đọc gia tốc, PWM buzzer và gom UART. Lớp thuật toán gồm bộ lọc IIR, ngưỡng thích nghi, RR, ratio-of-ratios, đếm bước và máy trạng thái té ngã. Lớp dịch vụ gồm checksum NMEA, DNS, HTTP, router JSON và dashboard trong flash. Nhờ vậy từng kết quả đều giải thích được trực tiếp từ mã nguồn của nhóm.</w:t>
       </w:r>
     </w:p>
     <w:p>

</xml_diff>